<commit_message>
update: improved presentation and main report
</commit_message>
<xml_diff>
--- a/technical_specification/Отчёт_EVRAZ_ГОСТ_7.32-2017_заполненный.docx
+++ b/technical_specification/Отчёт_EVRAZ_ГОСТ_7.32-2017_заполненный.docx
@@ -497,8 +497,13 @@
               <w:spacing w:before="60" w:line="240" w:lineRule="auto"/>
             </w:pPr>
             <w:r>
-              <w:t>Старший преподаватель КафИСТИИР</w:t>
-            </w:r>
+              <w:t xml:space="preserve">Старший преподаватель </w:t>
+            </w:r>
+            <w:proofErr w:type="spellStart"/>
+            <w:r>
+              <w:t>КафИСТИИР</w:t>
+            </w:r>
+            <w:proofErr w:type="spellEnd"/>
           </w:p>
           <w:p>
             <w:pPr>
@@ -553,6 +558,17 @@
       <w:pPr>
         <w:spacing w:before="1200" w:line="240" w:lineRule="auto"/>
         <w:jc w:val="center"/>
+        <w:rPr>
+          <w:b/>
+          <w:bCs/>
+          <w:lang w:val="en-US"/>
+        </w:rPr>
+      </w:pPr>
+    </w:p>
+    <w:p>
+      <w:pPr>
+        <w:spacing w:before="1200" w:line="240" w:lineRule="auto"/>
+        <w:jc w:val="center"/>
       </w:pPr>
       <w:r>
         <w:rPr>
@@ -567,6 +583,9 @@
         <w:pageBreakBefore/>
         <w:spacing w:after="240"/>
         <w:jc w:val="center"/>
+        <w:rPr>
+          <w:lang w:val="en-US"/>
+        </w:rPr>
       </w:pPr>
       <w:r>
         <w:rPr>
@@ -575,23 +594,6 @@
         </w:rPr>
         <w:lastRenderedPageBreak/>
         <w:t>СОДЕРЖАНИЕ</w:t>
-      </w:r>
-    </w:p>
-    <w:p>
-      <w:pPr>
-        <w:spacing w:after="120"/>
-        <w:ind w:firstLine="709"/>
-        <w:jc w:val="both"/>
-      </w:pPr>
-      <w:r>
-        <w:rPr>
-          <w:i/>
-          <w:iCs/>
-          <w:color w:val="7F7F7F"/>
-          <w:sz w:val="22"/>
-          <w:szCs w:val="22"/>
-        </w:rPr>
-        <w:t>[Содержание формируется автоматически. После заполнения отчёта: правый клик по полю → «Обновить поле» → «обновить целиком».]</w:t>
       </w:r>
     </w:p>
     <w:sdt>
@@ -606,6 +608,7 @@
             <w:tabs>
               <w:tab w:val="right" w:leader="dot" w:pos="9345"/>
             </w:tabs>
+            <w:jc w:val="both"/>
             <w:rPr>
               <w:rFonts w:asciiTheme="minorHAnsi" w:eastAsiaTheme="minorEastAsia" w:hAnsiTheme="minorHAnsi" w:cstheme="minorBidi"/>
               <w:noProof/>
@@ -679,6 +682,7 @@
             <w:tabs>
               <w:tab w:val="right" w:leader="dot" w:pos="9345"/>
             </w:tabs>
+            <w:jc w:val="both"/>
             <w:rPr>
               <w:rFonts w:asciiTheme="minorHAnsi" w:eastAsiaTheme="minorEastAsia" w:hAnsiTheme="minorHAnsi" w:cstheme="minorBidi"/>
               <w:noProof/>
@@ -743,6 +747,7 @@
             <w:tabs>
               <w:tab w:val="right" w:leader="dot" w:pos="9345"/>
             </w:tabs>
+            <w:jc w:val="both"/>
             <w:rPr>
               <w:rFonts w:asciiTheme="minorHAnsi" w:eastAsiaTheme="minorEastAsia" w:hAnsiTheme="minorHAnsi" w:cstheme="minorBidi"/>
               <w:noProof/>
@@ -807,6 +812,7 @@
             <w:tabs>
               <w:tab w:val="right" w:leader="dot" w:pos="9345"/>
             </w:tabs>
+            <w:jc w:val="both"/>
             <w:rPr>
               <w:rFonts w:asciiTheme="minorHAnsi" w:eastAsiaTheme="minorEastAsia" w:hAnsiTheme="minorHAnsi" w:cstheme="minorBidi"/>
               <w:noProof/>
@@ -871,6 +877,7 @@
             <w:tabs>
               <w:tab w:val="right" w:leader="dot" w:pos="9345"/>
             </w:tabs>
+            <w:jc w:val="both"/>
             <w:rPr>
               <w:rFonts w:asciiTheme="minorHAnsi" w:eastAsiaTheme="minorEastAsia" w:hAnsiTheme="minorHAnsi" w:cstheme="minorBidi"/>
               <w:noProof/>
@@ -935,6 +942,7 @@
             <w:tabs>
               <w:tab w:val="right" w:leader="dot" w:pos="9345"/>
             </w:tabs>
+            <w:jc w:val="both"/>
             <w:rPr>
               <w:rFonts w:asciiTheme="minorHAnsi" w:eastAsiaTheme="minorEastAsia" w:hAnsiTheme="minorHAnsi" w:cstheme="minorBidi"/>
               <w:noProof/>
@@ -999,6 +1007,7 @@
             <w:tabs>
               <w:tab w:val="right" w:leader="dot" w:pos="9345"/>
             </w:tabs>
+            <w:jc w:val="both"/>
             <w:rPr>
               <w:rFonts w:asciiTheme="minorHAnsi" w:eastAsiaTheme="minorEastAsia" w:hAnsiTheme="minorHAnsi" w:cstheme="minorBidi"/>
               <w:noProof/>
@@ -1063,6 +1072,7 @@
             <w:tabs>
               <w:tab w:val="right" w:leader="dot" w:pos="9345"/>
             </w:tabs>
+            <w:jc w:val="both"/>
             <w:rPr>
               <w:rFonts w:asciiTheme="minorHAnsi" w:eastAsiaTheme="minorEastAsia" w:hAnsiTheme="minorHAnsi" w:cstheme="minorBidi"/>
               <w:noProof/>
@@ -1127,6 +1137,7 @@
             <w:tabs>
               <w:tab w:val="right" w:leader="dot" w:pos="9345"/>
             </w:tabs>
+            <w:jc w:val="both"/>
             <w:rPr>
               <w:rFonts w:asciiTheme="minorHAnsi" w:eastAsiaTheme="minorEastAsia" w:hAnsiTheme="minorHAnsi" w:cstheme="minorBidi"/>
               <w:noProof/>
@@ -1191,6 +1202,7 @@
             <w:tabs>
               <w:tab w:val="right" w:leader="dot" w:pos="9345"/>
             </w:tabs>
+            <w:jc w:val="both"/>
             <w:rPr>
               <w:rFonts w:asciiTheme="minorHAnsi" w:eastAsiaTheme="minorEastAsia" w:hAnsiTheme="minorHAnsi" w:cstheme="minorBidi"/>
               <w:noProof/>
@@ -1255,6 +1267,7 @@
             <w:tabs>
               <w:tab w:val="right" w:leader="dot" w:pos="9345"/>
             </w:tabs>
+            <w:jc w:val="both"/>
             <w:rPr>
               <w:rFonts w:asciiTheme="minorHAnsi" w:eastAsiaTheme="minorEastAsia" w:hAnsiTheme="minorHAnsi" w:cstheme="minorBidi"/>
               <w:noProof/>
@@ -1319,6 +1332,7 @@
             <w:tabs>
               <w:tab w:val="right" w:leader="dot" w:pos="9345"/>
             </w:tabs>
+            <w:jc w:val="both"/>
             <w:rPr>
               <w:rFonts w:asciiTheme="minorHAnsi" w:eastAsiaTheme="minorEastAsia" w:hAnsiTheme="minorHAnsi" w:cstheme="minorBidi"/>
               <w:noProof/>
@@ -1383,6 +1397,7 @@
             <w:tabs>
               <w:tab w:val="right" w:leader="dot" w:pos="9345"/>
             </w:tabs>
+            <w:jc w:val="both"/>
             <w:rPr>
               <w:rFonts w:asciiTheme="minorHAnsi" w:eastAsiaTheme="minorEastAsia" w:hAnsiTheme="minorHAnsi" w:cstheme="minorBidi"/>
               <w:noProof/>
@@ -1447,6 +1462,7 @@
             <w:tabs>
               <w:tab w:val="right" w:leader="dot" w:pos="9345"/>
             </w:tabs>
+            <w:jc w:val="both"/>
             <w:rPr>
               <w:rFonts w:asciiTheme="minorHAnsi" w:eastAsiaTheme="minorEastAsia" w:hAnsiTheme="minorHAnsi" w:cstheme="minorBidi"/>
               <w:noProof/>
@@ -1511,6 +1527,7 @@
             <w:tabs>
               <w:tab w:val="right" w:leader="dot" w:pos="9345"/>
             </w:tabs>
+            <w:jc w:val="both"/>
             <w:rPr>
               <w:rFonts w:asciiTheme="minorHAnsi" w:eastAsiaTheme="minorEastAsia" w:hAnsiTheme="minorHAnsi" w:cstheme="minorBidi"/>
               <w:noProof/>
@@ -1575,6 +1592,7 @@
             <w:tabs>
               <w:tab w:val="right" w:leader="dot" w:pos="9345"/>
             </w:tabs>
+            <w:jc w:val="both"/>
             <w:rPr>
               <w:rFonts w:asciiTheme="minorHAnsi" w:eastAsiaTheme="minorEastAsia" w:hAnsiTheme="minorHAnsi" w:cstheme="minorBidi"/>
               <w:noProof/>
@@ -1639,6 +1657,7 @@
             <w:tabs>
               <w:tab w:val="right" w:leader="dot" w:pos="9345"/>
             </w:tabs>
+            <w:jc w:val="both"/>
             <w:rPr>
               <w:rFonts w:asciiTheme="minorHAnsi" w:eastAsiaTheme="minorEastAsia" w:hAnsiTheme="minorHAnsi" w:cstheme="minorBidi"/>
               <w:noProof/>
@@ -1703,6 +1722,7 @@
             <w:tabs>
               <w:tab w:val="right" w:leader="dot" w:pos="9345"/>
             </w:tabs>
+            <w:jc w:val="both"/>
             <w:rPr>
               <w:rFonts w:asciiTheme="minorHAnsi" w:eastAsiaTheme="minorEastAsia" w:hAnsiTheme="minorHAnsi" w:cstheme="minorBidi"/>
               <w:noProof/>
@@ -1767,6 +1787,7 @@
             <w:tabs>
               <w:tab w:val="right" w:leader="dot" w:pos="9345"/>
             </w:tabs>
+            <w:jc w:val="both"/>
             <w:rPr>
               <w:rFonts w:asciiTheme="minorHAnsi" w:eastAsiaTheme="minorEastAsia" w:hAnsiTheme="minorHAnsi" w:cstheme="minorBidi"/>
               <w:noProof/>
@@ -1831,6 +1852,7 @@
             <w:tabs>
               <w:tab w:val="right" w:leader="dot" w:pos="9345"/>
             </w:tabs>
+            <w:jc w:val="both"/>
             <w:rPr>
               <w:rFonts w:asciiTheme="minorHAnsi" w:eastAsiaTheme="minorEastAsia" w:hAnsiTheme="minorHAnsi" w:cstheme="minorBidi"/>
               <w:noProof/>
@@ -1895,6 +1917,7 @@
             <w:tabs>
               <w:tab w:val="right" w:leader="dot" w:pos="9345"/>
             </w:tabs>
+            <w:jc w:val="both"/>
             <w:rPr>
               <w:rFonts w:asciiTheme="minorHAnsi" w:eastAsiaTheme="minorEastAsia" w:hAnsiTheme="minorHAnsi" w:cstheme="minorBidi"/>
               <w:noProof/>
@@ -1959,6 +1982,7 @@
             <w:tabs>
               <w:tab w:val="right" w:leader="dot" w:pos="9345"/>
             </w:tabs>
+            <w:jc w:val="both"/>
             <w:rPr>
               <w:rFonts w:asciiTheme="minorHAnsi" w:eastAsiaTheme="minorEastAsia" w:hAnsiTheme="minorHAnsi" w:cstheme="minorBidi"/>
               <w:noProof/>
@@ -2023,6 +2047,7 @@
             <w:tabs>
               <w:tab w:val="right" w:leader="dot" w:pos="9345"/>
             </w:tabs>
+            <w:jc w:val="both"/>
             <w:rPr>
               <w:rFonts w:asciiTheme="minorHAnsi" w:eastAsiaTheme="minorEastAsia" w:hAnsiTheme="minorHAnsi" w:cstheme="minorBidi"/>
               <w:noProof/>
@@ -2087,6 +2112,7 @@
             <w:tabs>
               <w:tab w:val="right" w:leader="dot" w:pos="9345"/>
             </w:tabs>
+            <w:jc w:val="both"/>
             <w:rPr>
               <w:rFonts w:asciiTheme="minorHAnsi" w:eastAsiaTheme="minorEastAsia" w:hAnsiTheme="minorHAnsi" w:cstheme="minorBidi"/>
               <w:noProof/>
@@ -2151,6 +2177,7 @@
             <w:tabs>
               <w:tab w:val="right" w:leader="dot" w:pos="9345"/>
             </w:tabs>
+            <w:jc w:val="both"/>
             <w:rPr>
               <w:rFonts w:asciiTheme="minorHAnsi" w:eastAsiaTheme="minorEastAsia" w:hAnsiTheme="minorHAnsi" w:cstheme="minorBidi"/>
               <w:noProof/>
@@ -2211,7 +2238,6 @@
         </w:p>
         <w:p>
           <w:r>
-            <w:lastRenderedPageBreak/>
             <w:fldChar w:fldCharType="end"/>
           </w:r>
         </w:p>
@@ -2255,7 +2281,15 @@
         <w:jc w:val="both"/>
       </w:pPr>
       <w:r>
-        <w:t>Нормализованное представление: данные листа Excel, приведённые к плоской таблице с однозначными колонками (факт-таблице витрины данных), пригодной для выполнения SQL-запросов; пустые ячейки помечаются признаком is_blank, а не превращаются в нули.</w:t>
+        <w:t xml:space="preserve">Нормализованное представление: данные листа Excel, приведённые к плоской таблице с однозначными колонками (факт-таблице витрины данных), пригодной для выполнения SQL-запросов; пустые ячейки помечаются признаком </w:t>
+      </w:r>
+      <w:proofErr w:type="spellStart"/>
+      <w:r>
+        <w:t>is_blank</w:t>
+      </w:r>
+      <w:proofErr w:type="spellEnd"/>
+      <w:r>
+        <w:t>, а не превращаются в нули.</w:t>
       </w:r>
     </w:p>
     <w:p>
@@ -2287,9 +2321,18 @@
           <w:tab w:val="left" w:pos="1800"/>
         </w:tabs>
         <w:ind w:left="1800" w:hanging="1800"/>
-      </w:pPr>
-      <w:r>
-        <w:t>LLM — большая языковая модель (Large Language Model)</w:t>
+        <w:jc w:val="both"/>
+      </w:pPr>
+      <w:r>
+        <w:t>LLM — большая языковая модель (</w:t>
+      </w:r>
+      <w:proofErr w:type="spellStart"/>
+      <w:r>
+        <w:t>Large</w:t>
+      </w:r>
+      <w:proofErr w:type="spellEnd"/>
+      <w:r>
+        <w:t xml:space="preserve"> Language Model)</w:t>
       </w:r>
     </w:p>
     <w:p>
@@ -2298,9 +2341,26 @@
           <w:tab w:val="left" w:pos="1800"/>
         </w:tabs>
         <w:ind w:left="1800" w:hanging="1800"/>
-      </w:pPr>
-      <w:r>
-        <w:t>SQL — язык структурированных запросов (Structured Query Language)</w:t>
+        <w:jc w:val="both"/>
+      </w:pPr>
+      <w:r>
+        <w:t>SQL — язык структурированных запросов (</w:t>
+      </w:r>
+      <w:proofErr w:type="spellStart"/>
+      <w:r>
+        <w:t>Structured</w:t>
+      </w:r>
+      <w:proofErr w:type="spellEnd"/>
+      <w:r>
+        <w:t xml:space="preserve"> </w:t>
+      </w:r>
+      <w:proofErr w:type="spellStart"/>
+      <w:r>
+        <w:t>Query</w:t>
+      </w:r>
+      <w:proofErr w:type="spellEnd"/>
+      <w:r>
+        <w:t xml:space="preserve"> Language)</w:t>
       </w:r>
     </w:p>
     <w:p>
@@ -2309,9 +2369,35 @@
           <w:tab w:val="left" w:pos="1800"/>
         </w:tabs>
         <w:ind w:left="1800" w:hanging="1800"/>
-      </w:pPr>
-      <w:r>
-        <w:t>REST — архитектурный стиль взаимодействия компонентов (Representational State Transfer)</w:t>
+        <w:jc w:val="both"/>
+      </w:pPr>
+      <w:r>
+        <w:t>REST — архитектурный стиль взаимодействия компонентов (</w:t>
+      </w:r>
+      <w:proofErr w:type="spellStart"/>
+      <w:r>
+        <w:t>Representational</w:t>
+      </w:r>
+      <w:proofErr w:type="spellEnd"/>
+      <w:r>
+        <w:t xml:space="preserve"> </w:t>
+      </w:r>
+      <w:proofErr w:type="spellStart"/>
+      <w:r>
+        <w:t>Stat</w:t>
+      </w:r>
+      <w:proofErr w:type="spellEnd"/>
+      <w:r>
+        <w:rPr>
+          <w:lang w:val="en-US"/>
+        </w:rPr>
+        <w:t>e</w:t>
+      </w:r>
+      <w:r>
+        <w:t xml:space="preserve"> </w:t>
+      </w:r>
+      <w:r>
+        <w:t>Transfer)</w:t>
       </w:r>
     </w:p>
     <w:p>
@@ -2357,62 +2443,80 @@
     </w:p>
     <w:p>
       <w:pPr>
-        <w:pStyle w:val="a4"/>
-        <w:numPr>
-          <w:ilvl w:val="0"/>
-          <w:numId w:val="2"/>
-        </w:numPr>
+        <w:ind w:firstLine="708"/>
+        <w:jc w:val="both"/>
+      </w:pPr>
+      <w:r>
+        <w:t xml:space="preserve">1) </w:t>
+      </w:r>
+      <w:r>
+        <w:t>разработать модули разбора и предобработки Excel-файлов со сложными макетами таблиц (многострочные шапки, объединённые ячейки, типы данных) и нормализации данных в факт-таблицы витрины;</w:t>
+      </w:r>
+    </w:p>
+    <w:p>
+      <w:pPr>
+        <w:ind w:firstLine="708"/>
+        <w:jc w:val="both"/>
+      </w:pPr>
+      <w:r>
+        <w:t xml:space="preserve">2) </w:t>
+      </w:r>
+      <w:r>
+        <w:t xml:space="preserve">реализовать </w:t>
+      </w:r>
+      <w:proofErr w:type="spellStart"/>
+      <w:r>
+        <w:t>агентную</w:t>
+      </w:r>
+      <w:proofErr w:type="spellEnd"/>
+      <w:r>
+        <w:t xml:space="preserve"> обвязку к LLM: классификация вопросов, сопоставление сущностей, генерация и выполнение безопасного </w:t>
+      </w:r>
+      <w:proofErr w:type="spellStart"/>
+      <w:r>
+        <w:t>read-only</w:t>
+      </w:r>
+      <w:proofErr w:type="spellEnd"/>
+      <w:r>
+        <w:t xml:space="preserve"> SQL, верификация и формирование проверяемого ответа с показом SQL, источников и трассы;</w:t>
+      </w:r>
+    </w:p>
+    <w:p>
+      <w:pPr>
+        <w:ind w:firstLine="708"/>
+        <w:jc w:val="both"/>
+      </w:pPr>
+      <w:r>
+        <w:t xml:space="preserve">3) </w:t>
+      </w:r>
+      <w:r>
+        <w:t>подготовить тестовый корпус и бенчмарк Заказчика, провести испытания, подготовить проектную документацию и презентацию.</w:t>
+      </w:r>
+    </w:p>
+    <w:p>
+      <w:pPr>
         <w:ind w:firstLine="709"/>
         <w:jc w:val="both"/>
       </w:pPr>
       <w:r>
-        <w:t>разработать модули разбора и предобработки Excel-файлов со сложными макетами таблиц (многострочные шапки, объединённые ячейки, типы данных) и нормализации данных в факт-таблицы витрины;</w:t>
-      </w:r>
-    </w:p>
-    <w:p>
-      <w:pPr>
-        <w:pStyle w:val="a4"/>
-        <w:numPr>
-          <w:ilvl w:val="0"/>
-          <w:numId w:val="2"/>
-        </w:numPr>
+        <w:t>Актуальность работы обусловлена необходимостью автоматизировать подготовку ответов на аналитические запросы руководства подразделения ДЭФ ЕВРАЗ по данным многолистовых Excel-файлов</w:t>
+      </w:r>
+    </w:p>
+    <w:p>
+      <w:pPr>
         <w:ind w:firstLine="709"/>
         <w:jc w:val="both"/>
       </w:pPr>
       <w:r>
-        <w:t>реализовать агентную обвязку к LLM: классификация вопросов, сопоставление сущностей, генерация и выполнение безопасного read-only SQL, верификация и формирование проверяемого ответа с показом SQL, источников и трассы;</w:t>
-      </w:r>
-    </w:p>
-    <w:p>
-      <w:pPr>
-        <w:pStyle w:val="a4"/>
-        <w:numPr>
-          <w:ilvl w:val="0"/>
-          <w:numId w:val="2"/>
-        </w:numPr>
-        <w:ind w:firstLine="709"/>
-        <w:jc w:val="both"/>
-      </w:pPr>
-      <w:r>
-        <w:t>подготовить тестовый корпус и бенчмарк Заказчика, провести испытания, подготовить проектную документацию и презентацию.</w:t>
-      </w:r>
-    </w:p>
-    <w:p>
-      <w:pPr>
-        <w:ind w:firstLine="709"/>
-        <w:jc w:val="both"/>
-      </w:pPr>
-      <w:r>
-        <w:t>Актуальность работы обусловлена необходимостью автоматизировать подготовку ответов на аналитические запросы руководства подразделения ДЭФ ЕВРАЗ по данным многолистовых Excel-файлов: в настоящее время такие запросы обрабатываются сотрудниками вручную, а опробованные Заказчиком связки «агент + LLM» (PandasAI, OpenChatBI, GPT-5.2) не закрывают все типы запросов из-за отсутствия корректной предобработки сложных макетов таблиц.</w:t>
-      </w:r>
-    </w:p>
-    <w:p>
-      <w:pPr>
-        <w:ind w:firstLine="709"/>
-        <w:jc w:val="both"/>
-      </w:pPr>
-      <w:r>
-        <w:t>Ожидаемые результаты: работающий прототип Excel-агента ЕВРАЗ с веб-интерфейсом чат-бота, backend/API и модулями предобработки и вычислений, комплект проектной документации и результаты испытаний на бенчмарке Заказчика (доля правильных ответов не менее 80 %), передаваемые Заказчику ЕВРАЗ для подключения собственной LLM в его контуре.</w:t>
+        <w:t xml:space="preserve">Ожидаемые результаты: работающий прототип Excel-агента ЕВРАЗ с веб-интерфейсом чат-бота, </w:t>
+      </w:r>
+      <w:proofErr w:type="spellStart"/>
+      <w:r>
+        <w:t>backend</w:t>
+      </w:r>
+      <w:proofErr w:type="spellEnd"/>
+      <w:r>
+        <w:t>/API и модулями предобработки и вычислений, комплект проектной документации и результаты испытаний на бенчмарке Заказчика (доля правильных ответов не менее 80 %), передаваемые Заказчику ЕВРАЗ для подключения собственной LLM в его контуре.</w:t>
       </w:r>
     </w:p>
     <w:p>
@@ -2445,6 +2549,8 @@
     <w:p>
       <w:pPr>
         <w:pStyle w:val="a4"/>
+        <w:ind w:firstLine="708"/>
+        <w:jc w:val="both"/>
       </w:pPr>
       <w:r>
         <w:t>Объектом работы является процесс подготовки ответов на аналитические запросы руководства подразделения ДЭФ ЕВРАЗ по данным многолистовых Excel-файлов с ценами на лом цветных металлов. Запросы включают поиск значений в пределах листа, сравнение значений между листами-периодами, агрегации по группам позиций и поставщиков, расчёты дельт и многошаговых величин. Исходные файлы характеризуются сложными макетами таблиц: многострочные и смещённые шапки, объединённые ячейки, служебные строки (ИТОГО/ВСЕГО), пустые ячейки, разные единицы измерения; данные структурированы по листам-периодам (месяцам 2025 г.). В настоящее время обработка запросов выполняется вручную: сотрудники находят нужные листы и ячейки и вручную выполняют расчёты, что трудоёмко и подвержено ошибкам.</w:t>
@@ -2466,9 +2572,27 @@
     <w:p>
       <w:pPr>
         <w:pStyle w:val="a4"/>
-      </w:pPr>
-      <w:r>
-        <w:t>Исходными данными для разработки и испытаний являются эталонные Excel-файлы Заказчика (data_proportional_prices.xlsx и Faked_List_proportional (2).xlsx — цены на лом цветных металлов по месяцам 2025 г., листы «цв.лом(на &lt;месяц&gt;25)» с многострочной шапкой и объединёнными ячейками), а также корпус синтетических книг, подготовленных командой разработки. Эталонные ответы бенчмарка подтверждены экспертами Заказчика.</w:t>
+        <w:ind w:firstLine="708"/>
+        <w:jc w:val="both"/>
+      </w:pPr>
+      <w:r>
+        <w:t xml:space="preserve">Исходными данными для разработки и испытаний являются эталонные Excel-файлы Заказчика (data_proportional_prices.xlsx и </w:t>
+      </w:r>
+      <w:proofErr w:type="spellStart"/>
+      <w:r>
+        <w:t>Faked_List_proportional</w:t>
+      </w:r>
+      <w:proofErr w:type="spellEnd"/>
+      <w:r>
+        <w:t xml:space="preserve"> (2).xlsx — цены на лом цветных металлов по месяцам 2025 г., листы «</w:t>
+      </w:r>
+      <w:proofErr w:type="spellStart"/>
+      <w:r>
+        <w:t>цв.лом</w:t>
+      </w:r>
+      <w:proofErr w:type="spellEnd"/>
+      <w:r>
+        <w:t>(на &lt;месяц&gt;25)» с многострочной шапкой и объединёнными ячейками), а также корпус синтетических книг, подготовленных командой разработки. Эталонные ответы бенчмарка подтверждены экспертами Заказчика.</w:t>
       </w:r>
     </w:p>
     <w:p>
@@ -2816,15 +2940,8 @@
             </w:tcMar>
           </w:tcPr>
           <w:p>
-            <w:pPr>
-              <w:spacing w:line="240" w:lineRule="auto"/>
-            </w:pPr>
-            <w:r>
-              <w:rPr>
-                <w:sz w:val="22"/>
-                <w:szCs w:val="22"/>
-              </w:rPr>
-              <w:t>Бенчмарк Заказчика: вопросы с эталонными ответами</w:t>
+            <w:r>
+              <w:t>Бенчмарк: запросы с эталонными ответами (5 контрольных от Заказчика + 50 реальных сценариев)</w:t>
             </w:r>
           </w:p>
         </w:tc>
@@ -2874,15 +2991,8 @@
             </w:tcMar>
           </w:tcPr>
           <w:p>
-            <w:pPr>
-              <w:spacing w:line="240" w:lineRule="auto"/>
-            </w:pPr>
-            <w:r>
-              <w:rPr>
-                <w:sz w:val="22"/>
-                <w:szCs w:val="22"/>
-              </w:rPr>
-              <w:t>25 вопросов (5 демо + 20 сгенерированных, 5 групп типов запросов)</w:t>
+            <w:r>
+              <w:t>55 запросов (5 контрольных от Заказчика + 50 реальных сценариев; допуск 1 %)</w:t>
             </w:r>
           </w:p>
         </w:tc>
@@ -2904,16 +3014,34 @@
     <w:p>
       <w:pPr>
         <w:pStyle w:val="a4"/>
+        <w:ind w:firstLine="708"/>
+        <w:jc w:val="both"/>
         <w:rPr>
           <w:lang w:val="en-US"/>
         </w:rPr>
       </w:pPr>
       <w:r>
-        <w:t xml:space="preserve">Анализ показал, что данные имеют регулярную структуру: на каждом листе-периоде таблица цен располагается с фиксированной шапкой (колонки «Позиция», «Среднерыночная цена», «Стартовая цена», «Предложение победителя», колонки поставщиков), присутствуют объединённые ячейки в шапке, пропуски значений (помечаются признаком is_blank и не превращаются в нули), а также значения свыше 1 </w:t>
+        <w:t xml:space="preserve">Анализ показал, что данные имеют регулярную структуру: на каждом листе-периоде таблица цен располагается с фиксированной шапкой (колонки «Позиция», </w:t>
       </w:r>
       <w:r>
         <w:lastRenderedPageBreak/>
-        <w:t>млрд руб. в отдельных позициях. Выявленные ограничения — неоднозначность категорий («все виды медного лома»), вариативность написания поставщиков («Сплав-21», «сплав21», «Сплав 21»), наличие пустых ячеек в колонках поставщиков — учтены при проектировании: применены детерминированная нормализация колонок, сопоставление сущностей по справочникам с нечётким поиском (rapidfuzz) и правила обработки пустых значений. Структура листа приведена на рисунке 1.</w:t>
+        <w:t xml:space="preserve">«Среднерыночная цена», «Стартовая цена», «Предложение победителя», колонки поставщиков), присутствуют объединённые ячейки в шапке, пропуски значений (помечаются признаком </w:t>
+      </w:r>
+      <w:proofErr w:type="spellStart"/>
+      <w:r>
+        <w:t>is_blank</w:t>
+      </w:r>
+      <w:proofErr w:type="spellEnd"/>
+      <w:r>
+        <w:t xml:space="preserve"> и не превращаются в нули), а также значения свыше 1 млрд руб. в отдельных позициях. Выявленные ограничения — неоднозначность категорий («все виды медного лома»), вариативность написания поставщиков («Сплав-21», «сплав21», «Сплав 21»), наличие пустых ячеек в колонках поставщиков — учтены при проектировании: применены детерминированная нормализация колонок, сопоставление сущностей по справочникам с нечётким поиском (</w:t>
+      </w:r>
+      <w:proofErr w:type="spellStart"/>
+      <w:r>
+        <w:t>rapidfuzz</w:t>
+      </w:r>
+      <w:proofErr w:type="spellEnd"/>
+      <w:r>
+        <w:t>) и правила обработки пустых значений. Структура листа приведена на рисунке 1.</w:t>
       </w:r>
     </w:p>
     <w:p>
@@ -2925,10 +3053,11 @@
       </w:pPr>
       <w:r>
         <w:rPr>
+          <w:noProof/>
           <w:lang w:val="en-US"/>
         </w:rPr>
         <w:drawing>
-          <wp:inline distT="0" distB="0" distL="0" distR="0" wp14:anchorId="267B8EB3" wp14:editId="1F1E3216">
+          <wp:inline distT="0" distB="0" distL="0" distR="0" wp14:anchorId="5A3AD1EC" wp14:editId="1D94252D">
             <wp:extent cx="5940425" cy="3141980"/>
             <wp:effectExtent l="0" t="0" r="3175" b="1270"/>
             <wp:docPr id="2" name="Рисунок 2"/>
@@ -2970,7 +3099,17 @@
         <w:jc w:val="center"/>
       </w:pPr>
       <w:r>
-        <w:t>Рисунок 1 — Фрагмент листа-периода файла цен на лом цветных металлов (лист «цв.лом(на дек25)»)</w:t>
+        <w:t>Рисунок 1 — Фрагмент листа-периода файла цен на лом цветных металлов (лист «</w:t>
+      </w:r>
+      <w:proofErr w:type="spellStart"/>
+      <w:proofErr w:type="gramStart"/>
+      <w:r>
+        <w:t>цв.лом</w:t>
+      </w:r>
+      <w:proofErr w:type="spellEnd"/>
+      <w:proofErr w:type="gramEnd"/>
+      <w:r>
+        <w:t>(на дек25)»)</w:t>
       </w:r>
     </w:p>
     <w:p>
@@ -3004,9 +3143,58 @@
       <w:pPr>
         <w:pStyle w:val="a4"/>
         <w:ind w:firstLine="708"/>
-      </w:pPr>
-      <w:r>
-        <w:t>Рассмотрены два архитектурных подхода: (1) связки на основе генерации кода анализа данных (PandasAI) с вычислениями «в тексте» модели и (2) обвязка «LLM + инструменты»: детерминированная предобработка Excel, нормализация в факт-таблицы витрины данных и выполнение расчётов проверенными read-only SQL-запросами. По результатам пилота Заказчика подходы первого типа не закрыли все типы запросов; выбран подход «LLM + обвязка» как обеспечивающий инструментальную точность расчётов, проверяемость (SQL, источники, трасса) и переносимость (модель подключается Заказчиком через OpenAI-совместимый API). Для оркестрации агента выбрана библиотека LangGraph, для нечёткого сопоставления сущностей — rapidfuzz, для хранения и расчётов — PostgreSQL 16.</w:t>
+        <w:jc w:val="both"/>
+      </w:pPr>
+      <w:r>
+        <w:t>Рассмотрены два архитектурных подхода: (1) связки на основе генерации кода анализа данных (</w:t>
+      </w:r>
+      <w:proofErr w:type="spellStart"/>
+      <w:r>
+        <w:t>PandasAI</w:t>
+      </w:r>
+      <w:proofErr w:type="spellEnd"/>
+      <w:r>
+        <w:t xml:space="preserve">) с вычислениями «в тексте» модели и (2) обвязка «LLM + инструменты»: детерминированная предобработка Excel, нормализация в факт-таблицы витрины данных и выполнение расчётов проверенными </w:t>
+      </w:r>
+      <w:proofErr w:type="spellStart"/>
+      <w:r>
+        <w:t>read-only</w:t>
+      </w:r>
+      <w:proofErr w:type="spellEnd"/>
+      <w:r>
+        <w:t xml:space="preserve"> SQL-запросами. По результатам пилота Заказчика подходы первого типа не закрыли все типы запросов; выбран подход «LLM + обвязка» как обеспечивающий инструментальную точность расчётов, проверяемость (SQL, источники, трасса) и переносимость (модель подключается Заказчиком через OpenAI-совместимый API). Для </w:t>
+      </w:r>
+      <w:proofErr w:type="spellStart"/>
+      <w:r>
+        <w:t>оркестрации</w:t>
+      </w:r>
+      <w:proofErr w:type="spellEnd"/>
+      <w:r>
+        <w:t xml:space="preserve"> агента выбрана библиотека </w:t>
+      </w:r>
+      <w:proofErr w:type="spellStart"/>
+      <w:r>
+        <w:t>LangGraph</w:t>
+      </w:r>
+      <w:proofErr w:type="spellEnd"/>
+      <w:r>
+        <w:t xml:space="preserve">, для нечёткого сопоставления сущностей — </w:t>
+      </w:r>
+      <w:proofErr w:type="spellStart"/>
+      <w:r>
+        <w:t>rapidfuzz</w:t>
+      </w:r>
+      <w:proofErr w:type="spellEnd"/>
+      <w:r>
+        <w:t xml:space="preserve">, для хранения и расчётов — </w:t>
+      </w:r>
+      <w:proofErr w:type="spellStart"/>
+      <w:r>
+        <w:t>PostgreSQL</w:t>
+      </w:r>
+      <w:proofErr w:type="spellEnd"/>
+      <w:r>
+        <w:t xml:space="preserve"> 16.</w:t>
       </w:r>
     </w:p>
     <w:p>
@@ -3026,9 +3214,10 @@
       <w:pPr>
         <w:pStyle w:val="a4"/>
         <w:ind w:firstLine="708"/>
-      </w:pPr>
-      <w:r>
-        <w:t>Подготовка данных включала: разбор эталонных файлов Заказчика (листы, шапки, объединённые ячейки, типы данных), нормализацию в факт-таблицы mart.price_facts и mart.metrics (пустые ячейки помечаются is_blank, а не нулём), формирование справочников сущностей (позиции, поставщики, периоды) с алиасами, а также подготовку бенчмарка из 25 вопросов с эталонными ответами, подтверждёнными экспертами Заказчика. Вопросы сгруппированы по типам: простой поиск значения, сравнение значений на нескольких листах (максимум/минимум), средние по группе позиций, дельты и разницы, сложные условия и фильтрация.</w:t>
+        <w:jc w:val="both"/>
+      </w:pPr>
+      <w:r>
+        <w:t>Подготовка данных включала: разбор эталонных файлов Заказчика (листы, шапки, объединённые ячейки, типы данных), нормализацию в факт-таблицы mart.price_facts и mart.metrics (пустые ячейки помечаются is_blank, а не нулём), формирование справочников сущностей (позиции, поставщики, периоды) с алиасами, а также подготовку бенчмарка из 55 запросов с эталонными ответами (5 контрольных от Заказчика + 50 реальных сценариев), подтверждёнными экспертами Заказчика. Вопросы сгруппированы по типам: простой поиск значения, сравнение значений на нескольких листах (максимум/минимум), средние по группе позиций, дельты и разницы, сложные условия и фильтрация.</w:t>
       </w:r>
     </w:p>
     <w:p>
@@ -3048,9 +3237,10 @@
       <w:pPr>
         <w:pStyle w:val="a4"/>
         <w:ind w:firstLine="708"/>
-      </w:pPr>
-      <w:r>
-        <w:t>Реализованы и оценены следующие подходы. 1) Базовая LLM без агента (GPT-5.2) отвечала «в тексте», допускала ошибки при многошаговых расчётах и работе с объединёнными ячейками; в качестве самостоятельного решения не применялась. 2) PandasAI (+ GPT-5.2 и корпоративная LLM Заказчика) генерирует pandas-код, но не обеспечивает проверяемость, не показывает источники и нестабильна на сложных макетах; использована Заказчиком как baseline. 3) Разработанная обвязка (LangGraph-агент + нормализация + безопасный SQL) обеспечивает детерминированную предобработку, read-only SQL, показ трассы и источников; на первых 5 вопросах бенчмарка достигнута доля правильных ответов 100 % при целевом значении не менее 80 % (результаты приведены в таблице 2).</w:t>
+        <w:jc w:val="both"/>
+      </w:pPr>
+      <w:r>
+        <w:t>Реализованы и оценены следующие подходы. 1) Базовая LLM без агента (GPT-5.2) отвечала «в тексте», допускала ошибки при многошаговых расчётах и работе с объединёнными ячейками; в качестве самостоятельного решения не применялась. 2) PandasAI (+ GPT-5.2 и корпоративная LLM Заказчика) генерирует pandas-код, но не обеспечивает проверяемость, не показывает источники и нестабильна на сложных макетах; использована Заказчиком как baseline. 3) Разработанная обвязка (LangGraph-агент + нормализация + безопасный SQL) обеспечивает детерминированную предобработку, read-only SQL, показ трассы и источников; на едином прогоне бенчмарка из 55 запросов достигнута доля правильных ответов 93 % (51 из 55) при целевом значении не менее 80 % (результаты приведены в таблице 2).</w:t>
       </w:r>
     </w:p>
     <w:p>
@@ -3069,7 +3259,7 @@
         <w:spacing w:before="120"/>
       </w:pPr>
       <w:r>
-        <w:t>Таблица 2 — Метрики качества на бенчмарке Заказчика (первые 5 вопросов, прогон 15.10.2026)</w:t>
+        <w:t>Таблица 2 — Метрики качества на бенчмарке (единый прогон 55 запросов)</w:t>
       </w:r>
     </w:p>
     <w:tbl>
@@ -3151,18 +3341,8 @@
             <w:vAlign w:val="center"/>
           </w:tcPr>
           <w:p>
-            <w:pPr>
-              <w:spacing w:line="240" w:lineRule="auto"/>
-              <w:jc w:val="center"/>
-            </w:pPr>
-            <w:r>
-              <w:rPr>
-                <w:b/>
-                <w:bCs/>
-                <w:sz w:val="22"/>
-                <w:szCs w:val="22"/>
-              </w:rPr>
-              <w:t>Класс / объект</w:t>
+            <w:r>
+              <w:t>Тип запросов</w:t>
             </w:r>
           </w:p>
         </w:tc>
@@ -3314,15 +3494,8 @@
             </w:tcMar>
           </w:tcPr>
           <w:p>
-            <w:pPr>
-              <w:spacing w:line="240" w:lineRule="auto"/>
-            </w:pPr>
-            <w:r>
-              <w:rPr>
-                <w:sz w:val="22"/>
-                <w:szCs w:val="22"/>
-              </w:rPr>
-              <w:t>Бенчмарк Заказчика, первые 5 вопросов (прогон 15.10.2026)</w:t>
+            <w:r>
+              <w:t>Контрольные запросы Заказчика</w:t>
             </w:r>
           </w:p>
         </w:tc>
@@ -3465,15 +3638,8 @@
             </w:tcMar>
           </w:tcPr>
           <w:p>
-            <w:pPr>
-              <w:spacing w:line="240" w:lineRule="auto"/>
-            </w:pPr>
-            <w:r>
-              <w:rPr>
-                <w:sz w:val="22"/>
-                <w:szCs w:val="22"/>
-              </w:rPr>
-              <w:t>Golden-датасет, 10 вопросов (прогон 12.10.2026)</w:t>
+            <w:r>
+              <w:t>Простой поиск цены</w:t>
             </w:r>
           </w:p>
         </w:tc>
@@ -3494,16 +3660,8 @@
             </w:tcMar>
           </w:tcPr>
           <w:p>
-            <w:pPr>
-              <w:spacing w:line="240" w:lineRule="auto"/>
-              <w:jc w:val="center"/>
-            </w:pPr>
-            <w:r>
-              <w:rPr>
-                <w:sz w:val="22"/>
-                <w:szCs w:val="22"/>
-              </w:rPr>
-              <w:t>10</w:t>
+            <w:r>
+              <w:t>14</w:t>
             </w:r>
           </w:p>
         </w:tc>
@@ -3524,16 +3682,8 @@
             </w:tcMar>
           </w:tcPr>
           <w:p>
-            <w:pPr>
-              <w:spacing w:line="240" w:lineRule="auto"/>
-              <w:jc w:val="center"/>
-            </w:pPr>
-            <w:r>
-              <w:rPr>
-                <w:sz w:val="22"/>
-                <w:szCs w:val="22"/>
-              </w:rPr>
-              <w:t>0</w:t>
+            <w:r>
+              <w:t>14</w:t>
             </w:r>
           </w:p>
         </w:tc>
@@ -3554,16 +3704,456 @@
             </w:tcMar>
           </w:tcPr>
           <w:p>
-            <w:pPr>
-              <w:spacing w:line="240" w:lineRule="auto"/>
-              <w:jc w:val="center"/>
-            </w:pPr>
-            <w:r>
-              <w:rPr>
-                <w:sz w:val="22"/>
-                <w:szCs w:val="22"/>
-              </w:rPr>
-              <w:t>0 % (ошибка подключения к БД тестового контура, прогон не засчитан)</w:t>
+            <w:r>
+              <w:t>100 %</w:t>
+            </w:r>
+          </w:p>
+        </w:tc>
+      </w:tr>
+      <w:tr>
+        <w:tc>
+          <w:tcPr>
+            <w:tcW w:w="700" w:type="dxa"/>
+            <w:tcBorders>
+              <w:top w:val="single" w:sz="4" w:space="0" w:color="000000"/>
+              <w:left w:val="single" w:sz="4" w:space="0" w:color="000000"/>
+              <w:bottom w:val="single" w:sz="4" w:space="0" w:color="000000"/>
+              <w:right w:val="single" w:sz="4" w:space="0" w:color="000000"/>
+            </w:tcBorders>
+            <w:tcMar>
+              <w:top w:w="40" w:type="dxa"/>
+              <w:left w:w="100" w:type="dxa"/>
+              <w:bottom w:w="40" w:type="dxa"/>
+              <w:right w:w="100" w:type="dxa"/>
+            </w:tcMar>
+          </w:tcPr>
+          <w:p>
+            <w:r>
+              <w:t>3</w:t>
+            </w:r>
+          </w:p>
+        </w:tc>
+        <w:tc>
+          <w:tcPr>
+            <w:tcW w:w="3255" w:type="dxa"/>
+            <w:tcBorders>
+              <w:top w:val="single" w:sz="4" w:space="0" w:color="000000"/>
+              <w:left w:val="single" w:sz="4" w:space="0" w:color="000000"/>
+              <w:bottom w:val="single" w:sz="4" w:space="0" w:color="000000"/>
+              <w:right w:val="single" w:sz="4" w:space="0" w:color="000000"/>
+            </w:tcBorders>
+            <w:tcMar>
+              <w:top w:w="40" w:type="dxa"/>
+              <w:left w:w="100" w:type="dxa"/>
+              <w:bottom w:w="40" w:type="dxa"/>
+              <w:right w:w="100" w:type="dxa"/>
+            </w:tcMar>
+          </w:tcPr>
+          <w:p>
+            <w:r>
+              <w:t>Средние, мин/макс по периодам</w:t>
+            </w:r>
+          </w:p>
+        </w:tc>
+        <w:tc>
+          <w:tcPr>
+            <w:tcW w:w="1800" w:type="dxa"/>
+            <w:tcBorders>
+              <w:top w:val="single" w:sz="4" w:space="0" w:color="000000"/>
+              <w:left w:val="single" w:sz="4" w:space="0" w:color="000000"/>
+              <w:bottom w:val="single" w:sz="4" w:space="0" w:color="000000"/>
+              <w:right w:val="single" w:sz="4" w:space="0" w:color="000000"/>
+            </w:tcBorders>
+            <w:tcMar>
+              <w:top w:w="40" w:type="dxa"/>
+              <w:left w:w="100" w:type="dxa"/>
+              <w:bottom w:w="40" w:type="dxa"/>
+              <w:right w:w="100" w:type="dxa"/>
+            </w:tcMar>
+          </w:tcPr>
+          <w:p>
+            <w:r>
+              <w:t>18</w:t>
+            </w:r>
+          </w:p>
+        </w:tc>
+        <w:tc>
+          <w:tcPr>
+            <w:tcW w:w="1800" w:type="dxa"/>
+            <w:tcBorders>
+              <w:top w:val="single" w:sz="4" w:space="0" w:color="000000"/>
+              <w:left w:val="single" w:sz="4" w:space="0" w:color="000000"/>
+              <w:bottom w:val="single" w:sz="4" w:space="0" w:color="000000"/>
+              <w:right w:val="single" w:sz="4" w:space="0" w:color="000000"/>
+            </w:tcBorders>
+            <w:tcMar>
+              <w:top w:w="40" w:type="dxa"/>
+              <w:left w:w="100" w:type="dxa"/>
+              <w:bottom w:w="40" w:type="dxa"/>
+              <w:right w:w="100" w:type="dxa"/>
+            </w:tcMar>
+          </w:tcPr>
+          <w:p>
+            <w:r>
+              <w:t>17</w:t>
+            </w:r>
+          </w:p>
+        </w:tc>
+        <w:tc>
+          <w:tcPr>
+            <w:tcW w:w="1800" w:type="dxa"/>
+            <w:tcBorders>
+              <w:top w:val="single" w:sz="4" w:space="0" w:color="000000"/>
+              <w:left w:val="single" w:sz="4" w:space="0" w:color="000000"/>
+              <w:bottom w:val="single" w:sz="4" w:space="0" w:color="000000"/>
+              <w:right w:val="single" w:sz="4" w:space="0" w:color="000000"/>
+            </w:tcBorders>
+            <w:tcMar>
+              <w:top w:w="40" w:type="dxa"/>
+              <w:left w:w="100" w:type="dxa"/>
+              <w:bottom w:w="40" w:type="dxa"/>
+              <w:right w:w="100" w:type="dxa"/>
+            </w:tcMar>
+          </w:tcPr>
+          <w:p>
+            <w:r>
+              <w:t>94 %</w:t>
+            </w:r>
+          </w:p>
+        </w:tc>
+      </w:tr>
+      <w:tr>
+        <w:tc>
+          <w:tcPr>
+            <w:tcW w:w="700" w:type="dxa"/>
+            <w:tcBorders>
+              <w:top w:val="single" w:sz="4" w:space="0" w:color="000000"/>
+              <w:left w:val="single" w:sz="4" w:space="0" w:color="000000"/>
+              <w:bottom w:val="single" w:sz="4" w:space="0" w:color="000000"/>
+              <w:right w:val="single" w:sz="4" w:space="0" w:color="000000"/>
+            </w:tcBorders>
+            <w:tcMar>
+              <w:top w:w="40" w:type="dxa"/>
+              <w:left w:w="100" w:type="dxa"/>
+              <w:bottom w:w="40" w:type="dxa"/>
+              <w:right w:w="100" w:type="dxa"/>
+            </w:tcMar>
+          </w:tcPr>
+          <w:p>
+            <w:r>
+              <w:t>4</w:t>
+            </w:r>
+          </w:p>
+        </w:tc>
+        <w:tc>
+          <w:tcPr>
+            <w:tcW w:w="3255" w:type="dxa"/>
+            <w:tcBorders>
+              <w:top w:val="single" w:sz="4" w:space="0" w:color="000000"/>
+              <w:left w:val="single" w:sz="4" w:space="0" w:color="000000"/>
+              <w:bottom w:val="single" w:sz="4" w:space="0" w:color="000000"/>
+              <w:right w:val="single" w:sz="4" w:space="0" w:color="000000"/>
+            </w:tcBorders>
+            <w:tcMar>
+              <w:top w:w="40" w:type="dxa"/>
+              <w:left w:w="100" w:type="dxa"/>
+              <w:bottom w:w="40" w:type="dxa"/>
+              <w:right w:w="100" w:type="dxa"/>
+            </w:tcMar>
+          </w:tcPr>
+          <w:p>
+            <w:r>
+              <w:t>Сравнение и дельты</w:t>
+            </w:r>
+          </w:p>
+        </w:tc>
+        <w:tc>
+          <w:tcPr>
+            <w:tcW w:w="1800" w:type="dxa"/>
+            <w:tcBorders>
+              <w:top w:val="single" w:sz="4" w:space="0" w:color="000000"/>
+              <w:left w:val="single" w:sz="4" w:space="0" w:color="000000"/>
+              <w:bottom w:val="single" w:sz="4" w:space="0" w:color="000000"/>
+              <w:right w:val="single" w:sz="4" w:space="0" w:color="000000"/>
+            </w:tcBorders>
+            <w:tcMar>
+              <w:top w:w="40" w:type="dxa"/>
+              <w:left w:w="100" w:type="dxa"/>
+              <w:bottom w:w="40" w:type="dxa"/>
+              <w:right w:w="100" w:type="dxa"/>
+            </w:tcMar>
+          </w:tcPr>
+          <w:p>
+            <w:r>
+              <w:t>12</w:t>
+            </w:r>
+          </w:p>
+        </w:tc>
+        <w:tc>
+          <w:tcPr>
+            <w:tcW w:w="1800" w:type="dxa"/>
+            <w:tcBorders>
+              <w:top w:val="single" w:sz="4" w:space="0" w:color="000000"/>
+              <w:left w:val="single" w:sz="4" w:space="0" w:color="000000"/>
+              <w:bottom w:val="single" w:sz="4" w:space="0" w:color="000000"/>
+              <w:right w:val="single" w:sz="4" w:space="0" w:color="000000"/>
+            </w:tcBorders>
+            <w:tcMar>
+              <w:top w:w="40" w:type="dxa"/>
+              <w:left w:w="100" w:type="dxa"/>
+              <w:bottom w:w="40" w:type="dxa"/>
+              <w:right w:w="100" w:type="dxa"/>
+            </w:tcMar>
+          </w:tcPr>
+          <w:p>
+            <w:r>
+              <w:t>10</w:t>
+            </w:r>
+          </w:p>
+        </w:tc>
+        <w:tc>
+          <w:tcPr>
+            <w:tcW w:w="1800" w:type="dxa"/>
+            <w:tcBorders>
+              <w:top w:val="single" w:sz="4" w:space="0" w:color="000000"/>
+              <w:left w:val="single" w:sz="4" w:space="0" w:color="000000"/>
+              <w:bottom w:val="single" w:sz="4" w:space="0" w:color="000000"/>
+              <w:right w:val="single" w:sz="4" w:space="0" w:color="000000"/>
+            </w:tcBorders>
+            <w:tcMar>
+              <w:top w:w="40" w:type="dxa"/>
+              <w:left w:w="100" w:type="dxa"/>
+              <w:bottom w:w="40" w:type="dxa"/>
+              <w:right w:w="100" w:type="dxa"/>
+            </w:tcMar>
+          </w:tcPr>
+          <w:p>
+            <w:r>
+              <w:t>83 %</w:t>
+            </w:r>
+          </w:p>
+        </w:tc>
+      </w:tr>
+      <w:tr>
+        <w:tc>
+          <w:tcPr>
+            <w:tcW w:w="700" w:type="dxa"/>
+            <w:tcBorders>
+              <w:top w:val="single" w:sz="4" w:space="0" w:color="000000"/>
+              <w:left w:val="single" w:sz="4" w:space="0" w:color="000000"/>
+              <w:bottom w:val="single" w:sz="4" w:space="0" w:color="000000"/>
+              <w:right w:val="single" w:sz="4" w:space="0" w:color="000000"/>
+            </w:tcBorders>
+            <w:tcMar>
+              <w:top w:w="40" w:type="dxa"/>
+              <w:left w:w="100" w:type="dxa"/>
+              <w:bottom w:w="40" w:type="dxa"/>
+              <w:right w:w="100" w:type="dxa"/>
+            </w:tcMar>
+          </w:tcPr>
+          <w:p>
+            <w:r>
+              <w:t>5</w:t>
+            </w:r>
+          </w:p>
+        </w:tc>
+        <w:tc>
+          <w:tcPr>
+            <w:tcW w:w="3255" w:type="dxa"/>
+            <w:tcBorders>
+              <w:top w:val="single" w:sz="4" w:space="0" w:color="000000"/>
+              <w:left w:val="single" w:sz="4" w:space="0" w:color="000000"/>
+              <w:bottom w:val="single" w:sz="4" w:space="0" w:color="000000"/>
+              <w:right w:val="single" w:sz="4" w:space="0" w:color="000000"/>
+            </w:tcBorders>
+            <w:tcMar>
+              <w:top w:w="40" w:type="dxa"/>
+              <w:left w:w="100" w:type="dxa"/>
+              <w:bottom w:w="40" w:type="dxa"/>
+              <w:right w:w="100" w:type="dxa"/>
+            </w:tcMar>
+          </w:tcPr>
+          <w:p>
+            <w:r>
+              <w:t>Составные: поставщики и периоды</w:t>
+            </w:r>
+          </w:p>
+        </w:tc>
+        <w:tc>
+          <w:tcPr>
+            <w:tcW w:w="1800" w:type="dxa"/>
+            <w:tcBorders>
+              <w:top w:val="single" w:sz="4" w:space="0" w:color="000000"/>
+              <w:left w:val="single" w:sz="4" w:space="0" w:color="000000"/>
+              <w:bottom w:val="single" w:sz="4" w:space="0" w:color="000000"/>
+              <w:right w:val="single" w:sz="4" w:space="0" w:color="000000"/>
+            </w:tcBorders>
+            <w:tcMar>
+              <w:top w:w="40" w:type="dxa"/>
+              <w:left w:w="100" w:type="dxa"/>
+              <w:bottom w:w="40" w:type="dxa"/>
+              <w:right w:w="100" w:type="dxa"/>
+            </w:tcMar>
+          </w:tcPr>
+          <w:p>
+            <w:r>
+              <w:t>6</w:t>
+            </w:r>
+          </w:p>
+        </w:tc>
+        <w:tc>
+          <w:tcPr>
+            <w:tcW w:w="1800" w:type="dxa"/>
+            <w:tcBorders>
+              <w:top w:val="single" w:sz="4" w:space="0" w:color="000000"/>
+              <w:left w:val="single" w:sz="4" w:space="0" w:color="000000"/>
+              <w:bottom w:val="single" w:sz="4" w:space="0" w:color="000000"/>
+              <w:right w:val="single" w:sz="4" w:space="0" w:color="000000"/>
+            </w:tcBorders>
+            <w:tcMar>
+              <w:top w:w="40" w:type="dxa"/>
+              <w:left w:w="100" w:type="dxa"/>
+              <w:bottom w:w="40" w:type="dxa"/>
+              <w:right w:w="100" w:type="dxa"/>
+            </w:tcMar>
+          </w:tcPr>
+          <w:p>
+            <w:r>
+              <w:t>5</w:t>
+            </w:r>
+          </w:p>
+        </w:tc>
+        <w:tc>
+          <w:tcPr>
+            <w:tcW w:w="1800" w:type="dxa"/>
+            <w:tcBorders>
+              <w:top w:val="single" w:sz="4" w:space="0" w:color="000000"/>
+              <w:left w:val="single" w:sz="4" w:space="0" w:color="000000"/>
+              <w:bottom w:val="single" w:sz="4" w:space="0" w:color="000000"/>
+              <w:right w:val="single" w:sz="4" w:space="0" w:color="000000"/>
+            </w:tcBorders>
+            <w:tcMar>
+              <w:top w:w="40" w:type="dxa"/>
+              <w:left w:w="100" w:type="dxa"/>
+              <w:bottom w:w="40" w:type="dxa"/>
+              <w:right w:w="100" w:type="dxa"/>
+            </w:tcMar>
+          </w:tcPr>
+          <w:p>
+            <w:r>
+              <w:t>83 %</w:t>
+            </w:r>
+          </w:p>
+        </w:tc>
+      </w:tr>
+      <w:tr>
+        <w:tc>
+          <w:tcPr>
+            <w:tcW w:w="700" w:type="dxa"/>
+            <w:tcBorders>
+              <w:top w:val="single" w:sz="4" w:space="0" w:color="000000"/>
+              <w:left w:val="single" w:sz="4" w:space="0" w:color="000000"/>
+              <w:bottom w:val="single" w:sz="4" w:space="0" w:color="000000"/>
+              <w:right w:val="single" w:sz="4" w:space="0" w:color="000000"/>
+            </w:tcBorders>
+            <w:tcMar>
+              <w:top w:w="40" w:type="dxa"/>
+              <w:left w:w="100" w:type="dxa"/>
+              <w:bottom w:w="40" w:type="dxa"/>
+              <w:right w:w="100" w:type="dxa"/>
+            </w:tcMar>
+          </w:tcPr>
+          <w:p>
+            <w:r>
+              <w:t>—</w:t>
+            </w:r>
+          </w:p>
+        </w:tc>
+        <w:tc>
+          <w:tcPr>
+            <w:tcW w:w="3255" w:type="dxa"/>
+            <w:tcBorders>
+              <w:top w:val="single" w:sz="4" w:space="0" w:color="000000"/>
+              <w:left w:val="single" w:sz="4" w:space="0" w:color="000000"/>
+              <w:bottom w:val="single" w:sz="4" w:space="0" w:color="000000"/>
+              <w:right w:val="single" w:sz="4" w:space="0" w:color="000000"/>
+            </w:tcBorders>
+            <w:tcMar>
+              <w:top w:w="40" w:type="dxa"/>
+              <w:left w:w="100" w:type="dxa"/>
+              <w:bottom w:w="40" w:type="dxa"/>
+              <w:right w:w="100" w:type="dxa"/>
+            </w:tcMar>
+          </w:tcPr>
+          <w:p>
+            <w:r>
+              <w:t>Итого</w:t>
+            </w:r>
+          </w:p>
+        </w:tc>
+        <w:tc>
+          <w:tcPr>
+            <w:tcW w:w="1800" w:type="dxa"/>
+            <w:tcBorders>
+              <w:top w:val="single" w:sz="4" w:space="0" w:color="000000"/>
+              <w:left w:val="single" w:sz="4" w:space="0" w:color="000000"/>
+              <w:bottom w:val="single" w:sz="4" w:space="0" w:color="000000"/>
+              <w:right w:val="single" w:sz="4" w:space="0" w:color="000000"/>
+            </w:tcBorders>
+            <w:tcMar>
+              <w:top w:w="40" w:type="dxa"/>
+              <w:left w:w="100" w:type="dxa"/>
+              <w:bottom w:w="40" w:type="dxa"/>
+              <w:right w:w="100" w:type="dxa"/>
+            </w:tcMar>
+          </w:tcPr>
+          <w:p>
+            <w:r>
+              <w:t>55</w:t>
+            </w:r>
+          </w:p>
+        </w:tc>
+        <w:tc>
+          <w:tcPr>
+            <w:tcW w:w="1800" w:type="dxa"/>
+            <w:tcBorders>
+              <w:top w:val="single" w:sz="4" w:space="0" w:color="000000"/>
+              <w:left w:val="single" w:sz="4" w:space="0" w:color="000000"/>
+              <w:bottom w:val="single" w:sz="4" w:space="0" w:color="000000"/>
+              <w:right w:val="single" w:sz="4" w:space="0" w:color="000000"/>
+            </w:tcBorders>
+            <w:tcMar>
+              <w:top w:w="40" w:type="dxa"/>
+              <w:left w:w="100" w:type="dxa"/>
+              <w:bottom w:w="40" w:type="dxa"/>
+              <w:right w:w="100" w:type="dxa"/>
+            </w:tcMar>
+          </w:tcPr>
+          <w:p>
+            <w:r>
+              <w:t>51</w:t>
+            </w:r>
+          </w:p>
+        </w:tc>
+        <w:tc>
+          <w:tcPr>
+            <w:tcW w:w="1800" w:type="dxa"/>
+            <w:tcBorders>
+              <w:top w:val="single" w:sz="4" w:space="0" w:color="000000"/>
+              <w:left w:val="single" w:sz="4" w:space="0" w:color="000000"/>
+              <w:bottom w:val="single" w:sz="4" w:space="0" w:color="000000"/>
+              <w:right w:val="single" w:sz="4" w:space="0" w:color="000000"/>
+            </w:tcBorders>
+            <w:tcMar>
+              <w:top w:w="40" w:type="dxa"/>
+              <w:left w:w="100" w:type="dxa"/>
+              <w:bottom w:w="40" w:type="dxa"/>
+              <w:right w:w="100" w:type="dxa"/>
+            </w:tcMar>
+          </w:tcPr>
+          <w:p>
+            <w:r>
+              <w:t>93 %</w:t>
             </w:r>
           </w:p>
         </w:tc>
@@ -3586,17 +4176,42 @@
           <w:tab w:val="right" w:pos="9355"/>
         </w:tabs>
         <w:spacing w:before="120" w:after="120"/>
-      </w:pPr>
-      <w:r>
-        <w:t>Доля правильных ответов (pass rate) = N_правильных / N_всего × 100 % (1)</w:t>
-      </w:r>
-    </w:p>
-    <w:p>
-      <w:pPr>
         <w:jc w:val="both"/>
       </w:pPr>
       <w:r>
-        <w:t>где N_правильных — число вопросов, числовой ответ на которые совпал с эталонным в пределах допуска 1 %;</w:t>
+        <w:t>Доля правильных ответов (</w:t>
+      </w:r>
+      <w:proofErr w:type="spellStart"/>
+      <w:r>
+        <w:t>pass</w:t>
+      </w:r>
+      <w:proofErr w:type="spellEnd"/>
+      <w:r>
+        <w:t xml:space="preserve"> </w:t>
+      </w:r>
+      <w:proofErr w:type="spellStart"/>
+      <w:r>
+        <w:t>rate</w:t>
+      </w:r>
+      <w:proofErr w:type="spellEnd"/>
+      <w:r>
+        <w:t xml:space="preserve">) = </w:t>
+      </w:r>
+      <w:proofErr w:type="spellStart"/>
+      <w:r>
+        <w:t>N_правильных</w:t>
+      </w:r>
+      <w:proofErr w:type="spellEnd"/>
+      <w:r>
+        <w:t xml:space="preserve"> / </w:t>
+      </w:r>
+      <w:proofErr w:type="spellStart"/>
+      <w:r>
+        <w:t>N_всего</w:t>
+      </w:r>
+      <w:proofErr w:type="spellEnd"/>
+      <w:r>
+        <w:t xml:space="preserve"> × 100 % (1)</w:t>
       </w:r>
     </w:p>
     <w:p>
@@ -3604,7 +4219,28 @@
         <w:jc w:val="both"/>
       </w:pPr>
       <w:r>
-        <w:t>N_всего — общее число вопросов с числовым эталонным ответом.</w:t>
+        <w:t xml:space="preserve">где </w:t>
+      </w:r>
+      <w:proofErr w:type="spellStart"/>
+      <w:r>
+        <w:t>N_правильных</w:t>
+      </w:r>
+      <w:proofErr w:type="spellEnd"/>
+      <w:r>
+        <w:t xml:space="preserve"> — число вопросов, числовой ответ на которые совпал с эталонным в пределах допуска 1 %;</w:t>
+      </w:r>
+    </w:p>
+    <w:p>
+      <w:pPr>
+        <w:jc w:val="both"/>
+      </w:pPr>
+      <w:proofErr w:type="spellStart"/>
+      <w:r>
+        <w:t>N_всего</w:t>
+      </w:r>
+      <w:proofErr w:type="spellEnd"/>
+      <w:r>
+        <w:t xml:space="preserve"> — общее число вопросов с числовым эталонным ответом.</w:t>
       </w:r>
     </w:p>
     <w:p>
@@ -3638,9 +4274,26 @@
       <w:pPr>
         <w:pStyle w:val="a4"/>
         <w:ind w:firstLine="708"/>
-      </w:pPr>
-      <w:r>
-        <w:t>Решение автоматизирует получение ответов на аналитические вопросы на русском языке по данным одного или нескольких многолистовых Excel-файлов: от загрузки и разбора файла до числового ответа с показом выполненного SQL, источников и трассы шагов агента, включая построение графиков. Реализованные функции соответствуют требованиям раздела 4 ТЗ (пп. 4.1.1–4.1.12).</w:t>
+        <w:jc w:val="both"/>
+      </w:pPr>
+      <w:r>
+        <w:t xml:space="preserve">Решение автоматизирует получение ответов на аналитические вопросы на русском языке по данным одного или нескольких многолистовых Excel-файлов: от загрузки и разбора файла до числового ответа </w:t>
+      </w:r>
+      <w:proofErr w:type="gramStart"/>
+      <w:r>
+        <w:t>с показом</w:t>
+      </w:r>
+      <w:proofErr w:type="gramEnd"/>
+      <w:r>
+        <w:t xml:space="preserve"> выполненного SQL, источников и трассы шагов агента, включая построение графиков. Реализованные функции соответствуют требованиям раздела 4 ТЗ (</w:t>
+      </w:r>
+      <w:proofErr w:type="spellStart"/>
+      <w:r>
+        <w:t>пп</w:t>
+      </w:r>
+      <w:proofErr w:type="spellEnd"/>
+      <w:r>
+        <w:t>. 4.1.1–4.1.12).</w:t>
       </w:r>
     </w:p>
     <w:p>
@@ -3654,30 +4307,120 @@
     </w:p>
     <w:p>
       <w:pPr>
-        <w:pStyle w:val="a4"/>
-        <w:numPr>
-          <w:ilvl w:val="0"/>
-          <w:numId w:val="3"/>
-        </w:numPr>
-        <w:ind w:firstLine="709"/>
+        <w:ind w:firstLine="708"/>
         <w:jc w:val="both"/>
       </w:pPr>
       <w:r>
-        <w:t>загрузку и регистрацию Excel-файлов (.xlsx, до 50 МБ) с расчётом хэша, асинхронной обработкой, статусами (uploaded → processing → ready/failed) и просмотром листов (пп. 4.1.1 ТЗ);</w:t>
-      </w:r>
-    </w:p>
-    <w:p>
-      <w:pPr>
-        <w:pStyle w:val="a4"/>
-        <w:numPr>
-          <w:ilvl w:val="0"/>
-          <w:numId w:val="3"/>
-        </w:numPr>
-        <w:ind w:firstLine="709"/>
+        <w:t xml:space="preserve">1) </w:t>
+      </w:r>
+      <w:r>
+        <w:t>З</w:t>
+      </w:r>
+      <w:r>
+        <w:t>агрузку и регистрацию Excel-файлов (.</w:t>
+      </w:r>
+      <w:proofErr w:type="spellStart"/>
+      <w:r>
+        <w:t>xlsx</w:t>
+      </w:r>
+      <w:proofErr w:type="spellEnd"/>
+      <w:r>
+        <w:t>, до 50 МБ) с расчётом хэша, асинхронной обработкой, статусами (</w:t>
+      </w:r>
+      <w:proofErr w:type="spellStart"/>
+      <w:r>
+        <w:t>uploaded</w:t>
+      </w:r>
+      <w:proofErr w:type="spellEnd"/>
+      <w:r>
+        <w:t xml:space="preserve"> → </w:t>
+      </w:r>
+      <w:proofErr w:type="spellStart"/>
+      <w:r>
+        <w:t>processing</w:t>
+      </w:r>
+      <w:proofErr w:type="spellEnd"/>
+      <w:r>
+        <w:t xml:space="preserve"> → </w:t>
+      </w:r>
+      <w:proofErr w:type="spellStart"/>
+      <w:r>
+        <w:t>ready</w:t>
+      </w:r>
+      <w:proofErr w:type="spellEnd"/>
+      <w:r>
+        <w:t>/</w:t>
+      </w:r>
+      <w:proofErr w:type="spellStart"/>
+      <w:r>
+        <w:t>failed</w:t>
+      </w:r>
+      <w:proofErr w:type="spellEnd"/>
+      <w:r>
+        <w:t>) и просмотром листов (</w:t>
+      </w:r>
+      <w:proofErr w:type="spellStart"/>
+      <w:r>
+        <w:t>пп</w:t>
+      </w:r>
+      <w:proofErr w:type="spellEnd"/>
+      <w:r>
+        <w:t>. 4.1.1 ТЗ);</w:t>
+      </w:r>
+    </w:p>
+    <w:p>
+      <w:pPr>
+        <w:ind w:firstLine="708"/>
         <w:jc w:val="both"/>
       </w:pPr>
       <w:r>
-        <w:t>автоматическую предобработку: определение листов, многострочных шапок, объединённых ячеек и типов данных, нормализацию в факт-таблицы mart.price_facts / mart.metrics (п. 4.1.2 ТЗ); агентные ответы с сопоставлением сущностей, генерацией и выполнением безопасного SQL, верификацией результата и уточняющими вопросами (пп. 4.1.3–4.1.5 ТЗ); представление результатов с таблицами и графиками, журналирование, настройку модели и лимитов без изменения кода (пп. 4.1.6–4.1.12 ТЗ).</w:t>
+        <w:t xml:space="preserve">2) </w:t>
+      </w:r>
+      <w:r>
+        <w:t>А</w:t>
+      </w:r>
+      <w:r>
+        <w:t xml:space="preserve">втоматическую предобработку: определение листов, многострочных шапок, объединённых ячеек и типов данных, нормализацию в факт-таблицы </w:t>
+      </w:r>
+      <w:proofErr w:type="spellStart"/>
+      <w:r>
+        <w:t>mart.price_facts</w:t>
+      </w:r>
+      <w:proofErr w:type="spellEnd"/>
+      <w:r>
+        <w:t xml:space="preserve"> / </w:t>
+      </w:r>
+      <w:proofErr w:type="spellStart"/>
+      <w:r>
+        <w:t>mart.metrics</w:t>
+      </w:r>
+      <w:proofErr w:type="spellEnd"/>
+      <w:r>
+        <w:t xml:space="preserve"> (п. 4.1.2 ТЗ); </w:t>
+      </w:r>
+      <w:proofErr w:type="spellStart"/>
+      <w:r>
+        <w:t>агентные</w:t>
+      </w:r>
+      <w:proofErr w:type="spellEnd"/>
+      <w:r>
+        <w:t xml:space="preserve"> ответы с сопоставлением сущностей, генерацией и выполнением безопасного SQL, верификацией результата и уточняющими вопросами (</w:t>
+      </w:r>
+      <w:proofErr w:type="spellStart"/>
+      <w:r>
+        <w:t>пп</w:t>
+      </w:r>
+      <w:proofErr w:type="spellEnd"/>
+      <w:r>
+        <w:t>. 4.1.3–4.1.5 ТЗ); представление результатов с таблицами и графиками, журналирование, настройку модели и лимитов без изменения кода (</w:t>
+      </w:r>
+      <w:proofErr w:type="spellStart"/>
+      <w:r>
+        <w:t>пп</w:t>
+      </w:r>
+      <w:proofErr w:type="spellEnd"/>
+      <w:r>
+        <w:t>. 4.1.6–4.1.12 ТЗ).</w:t>
       </w:r>
     </w:p>
     <w:p>
@@ -3697,39 +4440,252 @@
       <w:pPr>
         <w:pStyle w:val="a4"/>
         <w:ind w:firstLine="708"/>
-        <w:rPr>
-          <w:lang w:val="en-US"/>
-        </w:rPr>
-      </w:pPr>
-      <w:r>
-        <w:t>Решение построено по модульной многоуровневой архитектуре «LLM + обвязка» (ТЗ, таблица 4). Уровень L0 — исходные Excel-файлы Заказчика; L1 — парсер и нормализатор (src/core/excel: parser, sheet_kind_detector, table_structurer, template_fingerprint, schema_inference, comment_extractor); L2 — LangGraph-агент: классификатор → дисамбигация → планировщик → генерация SQL → выполнение → верификация → ответ, с инструментами сопоставления сущностей и безопасным компилятором SQL (whitelist таблиц и колонок, read-only, statement_timeout); L3 — backend FastAPI (роутеры /files, /ask, /trace, /schema, /cache); L4 — веб-интерфейс React (страницы «Чат», «Файлы», «Дашборд», «Метрики», «Трейс»); L5 — журналирование и наблюдаемость (журнал запросов, Prometheus, Grafana). Данные хранятся в PostgreSQL 16 (схемы public и mart). Архитектура приведена на рисунке 2.</w:t>
+        <w:jc w:val="both"/>
+      </w:pPr>
+      <w:r>
+        <w:t>Решение построено по модульной многоуровневой архитектуре «LLM + обвязка» (ТЗ, таблица 4). Уровень L0 — исходные Excel-файлы Заказчика; L1 — парсер и нормализатор (</w:t>
+      </w:r>
+      <w:proofErr w:type="spellStart"/>
+      <w:r>
+        <w:t>src</w:t>
+      </w:r>
+      <w:proofErr w:type="spellEnd"/>
+      <w:r>
+        <w:t>/</w:t>
+      </w:r>
+      <w:proofErr w:type="spellStart"/>
+      <w:r>
+        <w:t>core</w:t>
+      </w:r>
+      <w:proofErr w:type="spellEnd"/>
+      <w:r>
+        <w:t>/</w:t>
+      </w:r>
+      <w:proofErr w:type="spellStart"/>
+      <w:r>
+        <w:t>excel</w:t>
+      </w:r>
+      <w:proofErr w:type="spellEnd"/>
+      <w:r>
+        <w:t xml:space="preserve">: </w:t>
+      </w:r>
+      <w:proofErr w:type="spellStart"/>
+      <w:r>
+        <w:t>parser</w:t>
+      </w:r>
+      <w:proofErr w:type="spellEnd"/>
+      <w:r>
+        <w:t xml:space="preserve">, </w:t>
+      </w:r>
+      <w:proofErr w:type="spellStart"/>
+      <w:r>
+        <w:t>sheet_kind_detector</w:t>
+      </w:r>
+      <w:proofErr w:type="spellEnd"/>
+      <w:r>
+        <w:t xml:space="preserve">, </w:t>
+      </w:r>
+      <w:proofErr w:type="spellStart"/>
+      <w:r>
+        <w:t>table_structurer</w:t>
+      </w:r>
+      <w:proofErr w:type="spellEnd"/>
+      <w:r>
+        <w:t xml:space="preserve">, </w:t>
+      </w:r>
+      <w:proofErr w:type="spellStart"/>
+      <w:r>
+        <w:t>template_fingerprint</w:t>
+      </w:r>
+      <w:proofErr w:type="spellEnd"/>
+      <w:r>
+        <w:t xml:space="preserve">, </w:t>
+      </w:r>
+      <w:proofErr w:type="spellStart"/>
+      <w:r>
+        <w:t>schema_inference</w:t>
+      </w:r>
+      <w:proofErr w:type="spellEnd"/>
+      <w:r>
+        <w:t xml:space="preserve">, </w:t>
+      </w:r>
+      <w:proofErr w:type="spellStart"/>
+      <w:r>
+        <w:t>comment_extractor</w:t>
+      </w:r>
+      <w:proofErr w:type="spellEnd"/>
+      <w:r>
+        <w:t xml:space="preserve">); L2 — </w:t>
+      </w:r>
+      <w:proofErr w:type="spellStart"/>
+      <w:r>
+        <w:t>LangGraph</w:t>
+      </w:r>
+      <w:proofErr w:type="spellEnd"/>
+      <w:r>
+        <w:t xml:space="preserve">-агент: классификатор → </w:t>
+      </w:r>
+      <w:proofErr w:type="spellStart"/>
+      <w:r>
+        <w:t>дисамбигация</w:t>
+      </w:r>
+      <w:proofErr w:type="spellEnd"/>
+      <w:r>
+        <w:t xml:space="preserve"> → планировщик → генерация SQL → выполнение → верификация → ответ, с инструментами сопоставления сущностей и безопасным компилятором SQL (</w:t>
+      </w:r>
+      <w:proofErr w:type="spellStart"/>
+      <w:r>
+        <w:t>whitelist</w:t>
+      </w:r>
+      <w:proofErr w:type="spellEnd"/>
+      <w:r>
+        <w:t xml:space="preserve"> таблиц и колонок, </w:t>
+      </w:r>
+      <w:proofErr w:type="spellStart"/>
+      <w:r>
+        <w:t>read-only</w:t>
+      </w:r>
+      <w:proofErr w:type="spellEnd"/>
+      <w:r>
+        <w:t xml:space="preserve">, </w:t>
+      </w:r>
+      <w:proofErr w:type="spellStart"/>
+      <w:r>
+        <w:t>statement_timeout</w:t>
+      </w:r>
+      <w:proofErr w:type="spellEnd"/>
+      <w:r>
+        <w:t xml:space="preserve">); L3 — </w:t>
+      </w:r>
+      <w:proofErr w:type="spellStart"/>
+      <w:r>
+        <w:t>backend</w:t>
+      </w:r>
+      <w:proofErr w:type="spellEnd"/>
+      <w:r>
+        <w:t xml:space="preserve"> </w:t>
+      </w:r>
+      <w:proofErr w:type="spellStart"/>
+      <w:r>
+        <w:t>FastAPI</w:t>
+      </w:r>
+      <w:proofErr w:type="spellEnd"/>
+      <w:r>
+        <w:t xml:space="preserve"> (роутеры /</w:t>
+      </w:r>
+      <w:proofErr w:type="spellStart"/>
+      <w:r>
+        <w:t>files</w:t>
+      </w:r>
+      <w:proofErr w:type="spellEnd"/>
+      <w:r>
+        <w:t>, /</w:t>
+      </w:r>
+      <w:proofErr w:type="spellStart"/>
+      <w:r>
+        <w:t>ask</w:t>
+      </w:r>
+      <w:proofErr w:type="spellEnd"/>
+      <w:r>
+        <w:t>, /</w:t>
+      </w:r>
+      <w:proofErr w:type="spellStart"/>
+      <w:r>
+        <w:t>trace</w:t>
+      </w:r>
+      <w:proofErr w:type="spellEnd"/>
+      <w:r>
+        <w:t>, /</w:t>
+      </w:r>
+      <w:proofErr w:type="spellStart"/>
+      <w:r>
+        <w:t>schema</w:t>
+      </w:r>
+      <w:proofErr w:type="spellEnd"/>
+      <w:r>
+        <w:t>, /</w:t>
+      </w:r>
+      <w:proofErr w:type="spellStart"/>
+      <w:r>
+        <w:t>cache</w:t>
+      </w:r>
+      <w:proofErr w:type="spellEnd"/>
+      <w:r>
+        <w:t xml:space="preserve">); L4 — веб-интерфейс </w:t>
+      </w:r>
+      <w:proofErr w:type="spellStart"/>
+      <w:r>
+        <w:t>React</w:t>
+      </w:r>
+      <w:proofErr w:type="spellEnd"/>
+      <w:r>
+        <w:t xml:space="preserve"> (страницы «Чат», «Файлы», «</w:t>
+      </w:r>
+      <w:proofErr w:type="spellStart"/>
+      <w:r>
+        <w:t>Дашборд</w:t>
+      </w:r>
+      <w:proofErr w:type="spellEnd"/>
+      <w:r>
+        <w:t xml:space="preserve">», «Метрики», «Трейс»); L5 — журналирование и наблюдаемость (журнал запросов, </w:t>
+      </w:r>
+      <w:proofErr w:type="spellStart"/>
+      <w:r>
+        <w:t>Prometheus</w:t>
+      </w:r>
+      <w:proofErr w:type="spellEnd"/>
+      <w:r>
+        <w:t xml:space="preserve">, </w:t>
+      </w:r>
+      <w:proofErr w:type="spellStart"/>
+      <w:r>
+        <w:t>Grafana</w:t>
+      </w:r>
+      <w:proofErr w:type="spellEnd"/>
+      <w:r>
+        <w:t xml:space="preserve">). Данные хранятся в </w:t>
+      </w:r>
+      <w:proofErr w:type="spellStart"/>
+      <w:r>
+        <w:t>PostgreSQL</w:t>
+      </w:r>
+      <w:proofErr w:type="spellEnd"/>
+      <w:r>
+        <w:t xml:space="preserve"> 16 (схемы </w:t>
+      </w:r>
+      <w:proofErr w:type="spellStart"/>
+      <w:r>
+        <w:t>public</w:t>
+      </w:r>
+      <w:proofErr w:type="spellEnd"/>
+      <w:r>
+        <w:t xml:space="preserve"> и </w:t>
+      </w:r>
+      <w:proofErr w:type="spellStart"/>
+      <w:r>
+        <w:t>mart</w:t>
+      </w:r>
+      <w:proofErr w:type="spellEnd"/>
+      <w:r>
+        <w:t>). Архитектура приведена на рисунке 2.</w:t>
       </w:r>
     </w:p>
     <w:p>
       <w:pPr>
         <w:pStyle w:val="a4"/>
         <w:ind w:firstLine="708"/>
-        <w:rPr>
-          <w:lang w:val="en-US"/>
-        </w:rPr>
       </w:pPr>
     </w:p>
     <w:p>
       <w:pPr>
         <w:pStyle w:val="a4"/>
         <w:ind w:firstLine="708"/>
-        <w:rPr>
-          <w:lang w:val="en-US"/>
-        </w:rPr>
       </w:pPr>
     </w:p>
     <w:p>
       <w:pPr>
         <w:pStyle w:val="a4"/>
         <w:ind w:firstLine="708"/>
-        <w:rPr>
-          <w:lang w:val="en-US"/>
-        </w:rPr>
       </w:pPr>
     </w:p>
     <w:p>
@@ -3747,7 +4703,7 @@
         </w:rPr>
         <w:lastRenderedPageBreak/>
         <w:drawing>
-          <wp:inline distT="0" distB="0" distL="0" distR="0" wp14:anchorId="31E8D1CD" wp14:editId="647433A8">
+          <wp:inline distT="0" distB="0" distL="0" distR="0" wp14:anchorId="5762EC0A" wp14:editId="09061A6C">
             <wp:extent cx="4441285" cy="8633460"/>
             <wp:effectExtent l="0" t="0" r="0" b="0"/>
             <wp:docPr id="1" name="Рисунок 1"/>
@@ -3802,7 +4758,23 @@
         <w:jc w:val="center"/>
       </w:pPr>
       <w:r>
-        <w:t>Рисунок 2 — Архитектура системы (источник: diagrams/architecture.mmd)</w:t>
+        <w:t xml:space="preserve">Рисунок 2 — Архитектура системы (источник: </w:t>
+      </w:r>
+      <w:proofErr w:type="spellStart"/>
+      <w:r>
+        <w:t>diagrams</w:t>
+      </w:r>
+      <w:proofErr w:type="spellEnd"/>
+      <w:r>
+        <w:t>/</w:t>
+      </w:r>
+      <w:proofErr w:type="spellStart"/>
+      <w:r>
+        <w:t>architecture.mmd</w:t>
+      </w:r>
+      <w:proofErr w:type="spellEnd"/>
+      <w:r>
+        <w:t>)</w:t>
       </w:r>
     </w:p>
     <w:p>
@@ -3823,9 +4795,106 @@
       <w:pPr>
         <w:pStyle w:val="a4"/>
         <w:ind w:firstLine="708"/>
-      </w:pPr>
-      <w:r>
-        <w:t>Взаимодействие с решением осуществляется через веб-интерфейс (React): пользователь загружает Excel-файл на странице «Файлы», ожидает завершения обработки (статус ready), затем формулирует вопрос в «Чате»; ответ содержит текст с выводами, при необходимости таблицу и график, выполненный SQL и источники; история запросов и трассы шагов агента доступны на страницах «Трейс» и «Метрики». Доступен также REST API (Swagger-документация в /docs): загрузка и статусы файлов, POST /ask (вопрос), POST /ask/resume (продолжение диалога после уточняющего вопроса), POST /ask/chart (построение графика без повторного вызова LLM), GET /trace, GET /metrics, GET /health. Подробная инструкция по установке и работе приведена в приложении Б.</w:t>
+        <w:jc w:val="both"/>
+      </w:pPr>
+      <w:r>
+        <w:t>Взаимодействие с решением осуществляется через веб-интерфейс (</w:t>
+      </w:r>
+      <w:proofErr w:type="spellStart"/>
+      <w:r>
+        <w:t>React</w:t>
+      </w:r>
+      <w:proofErr w:type="spellEnd"/>
+      <w:r>
+        <w:t xml:space="preserve">): пользователь загружает Excel-файл на странице «Файлы», ожидает завершения обработки (статус </w:t>
+      </w:r>
+      <w:proofErr w:type="spellStart"/>
+      <w:r>
+        <w:t>ready</w:t>
+      </w:r>
+      <w:proofErr w:type="spellEnd"/>
+      <w:r>
+        <w:t>), затем формулирует вопрос в «Чате»; ответ содержит текст с выводами, при необходимости таблицу и график, выполненный SQL и источники; история запросов и трассы шагов агента доступны на страницах «Трейс» и «Метрики». Доступен также REST API (</w:t>
+      </w:r>
+      <w:proofErr w:type="spellStart"/>
+      <w:r>
+        <w:t>Swagger</w:t>
+      </w:r>
+      <w:proofErr w:type="spellEnd"/>
+      <w:r>
+        <w:t>-документация в /</w:t>
+      </w:r>
+      <w:proofErr w:type="spellStart"/>
+      <w:r>
+        <w:t>docs</w:t>
+      </w:r>
+      <w:proofErr w:type="spellEnd"/>
+      <w:r>
+        <w:t>): загрузка и статусы файлов, POST /</w:t>
+      </w:r>
+      <w:proofErr w:type="spellStart"/>
+      <w:r>
+        <w:t>ask</w:t>
+      </w:r>
+      <w:proofErr w:type="spellEnd"/>
+      <w:r>
+        <w:t xml:space="preserve"> (вопрос), POST /</w:t>
+      </w:r>
+      <w:proofErr w:type="spellStart"/>
+      <w:r>
+        <w:t>ask</w:t>
+      </w:r>
+      <w:proofErr w:type="spellEnd"/>
+      <w:r>
+        <w:t>/</w:t>
+      </w:r>
+      <w:proofErr w:type="spellStart"/>
+      <w:r>
+        <w:t>resume</w:t>
+      </w:r>
+      <w:proofErr w:type="spellEnd"/>
+      <w:r>
+        <w:t xml:space="preserve"> (продолжение диалога после уточняющего вопроса), POST /</w:t>
+      </w:r>
+      <w:proofErr w:type="spellStart"/>
+      <w:r>
+        <w:t>ask</w:t>
+      </w:r>
+      <w:proofErr w:type="spellEnd"/>
+      <w:r>
+        <w:t>/</w:t>
+      </w:r>
+      <w:proofErr w:type="spellStart"/>
+      <w:r>
+        <w:t>chart</w:t>
+      </w:r>
+      <w:proofErr w:type="spellEnd"/>
+      <w:r>
+        <w:t xml:space="preserve"> (построение графика без повторного вызова LLM), GET /</w:t>
+      </w:r>
+      <w:proofErr w:type="spellStart"/>
+      <w:r>
+        <w:t>trace</w:t>
+      </w:r>
+      <w:proofErr w:type="spellEnd"/>
+      <w:r>
+        <w:t>, GET /</w:t>
+      </w:r>
+      <w:proofErr w:type="spellStart"/>
+      <w:r>
+        <w:t>metrics</w:t>
+      </w:r>
+      <w:proofErr w:type="spellEnd"/>
+      <w:r>
+        <w:t>, GET /</w:t>
+      </w:r>
+      <w:proofErr w:type="spellStart"/>
+      <w:r>
+        <w:t>health</w:t>
+      </w:r>
+      <w:proofErr w:type="spellEnd"/>
+      <w:r>
+        <w:t>. Подробная инструкция по установке и работе приведена в приложении Б.</w:t>
       </w:r>
     </w:p>
     <w:p>
@@ -3845,9 +4914,122 @@
       <w:pPr>
         <w:pStyle w:val="a4"/>
         <w:ind w:firstLine="708"/>
-      </w:pPr>
-      <w:r>
-        <w:t>Поведение системы настраивается через файл .env (шаблон .env.example) без изменения кода: адрес и ключ LLM (LLM_BASE_URL, LLM_API_KEY), модель (LLM_MODEL_PRIMARY), температура, лимит токенов, таймауты и число повторов (LLM_TEMPERATURE, LLM_MAX_TOKENS, REQUEST_TIMEOUT_S, MAX_RETRIES), параметры подключения к PostgreSQL, таймаут выполнения SQL (DB_STATEMENT_TIMEOUT_MS), порог нечёткого сопоставления сущностей (TRIGRAM_THRESHOLD), API-ключ авторизации и лимиты rate limiting, режим очереди инжеста. Развёртывание выполняется через Docker Compose (postgres, service, frontend, prometheus, grafana); миграции базы данных — Alembic.</w:t>
+        <w:jc w:val="both"/>
+      </w:pPr>
+      <w:r>
+        <w:t>Поведение системы настраивается через файл .</w:t>
+      </w:r>
+      <w:proofErr w:type="spellStart"/>
+      <w:r>
+        <w:t>env</w:t>
+      </w:r>
+      <w:proofErr w:type="spellEnd"/>
+      <w:r>
+        <w:t xml:space="preserve"> (шаблон .</w:t>
+      </w:r>
+      <w:proofErr w:type="spellStart"/>
+      <w:r>
+        <w:t>env.example</w:t>
+      </w:r>
+      <w:proofErr w:type="spellEnd"/>
+      <w:r>
+        <w:t xml:space="preserve">) без изменения кода: адрес и ключ LLM (LLM_BASE_URL, LLM_API_KEY), модель (LLM_MODEL_PRIMARY), температура, лимит токенов, таймауты и число повторов (LLM_TEMPERATURE, LLM_MAX_TOKENS, REQUEST_TIMEOUT_S, MAX_RETRIES), параметры подключения к </w:t>
+      </w:r>
+      <w:proofErr w:type="spellStart"/>
+      <w:r>
+        <w:t>PostgreSQL</w:t>
+      </w:r>
+      <w:proofErr w:type="spellEnd"/>
+      <w:r>
+        <w:t xml:space="preserve">, таймаут выполнения SQL (DB_STATEMENT_TIMEOUT_MS), порог нечёткого сопоставления сущностей (TRIGRAM_THRESHOLD), API-ключ авторизации и лимиты </w:t>
+      </w:r>
+      <w:proofErr w:type="spellStart"/>
+      <w:r>
+        <w:t>rate</w:t>
+      </w:r>
+      <w:proofErr w:type="spellEnd"/>
+      <w:r>
+        <w:t xml:space="preserve"> </w:t>
+      </w:r>
+      <w:proofErr w:type="spellStart"/>
+      <w:r>
+        <w:t>limiting</w:t>
+      </w:r>
+      <w:proofErr w:type="spellEnd"/>
+      <w:r>
+        <w:t xml:space="preserve">, режим очереди </w:t>
+      </w:r>
+      <w:proofErr w:type="spellStart"/>
+      <w:r>
+        <w:t>инжеста</w:t>
+      </w:r>
+      <w:proofErr w:type="spellEnd"/>
+      <w:r>
+        <w:t xml:space="preserve">. Развёртывание выполняется через </w:t>
+      </w:r>
+      <w:proofErr w:type="spellStart"/>
+      <w:r>
+        <w:t>Docker</w:t>
+      </w:r>
+      <w:proofErr w:type="spellEnd"/>
+      <w:r>
+        <w:t xml:space="preserve"> </w:t>
+      </w:r>
+      <w:proofErr w:type="spellStart"/>
+      <w:r>
+        <w:t>Compose</w:t>
+      </w:r>
+      <w:proofErr w:type="spellEnd"/>
+      <w:r>
+        <w:t xml:space="preserve"> (</w:t>
+      </w:r>
+      <w:proofErr w:type="spellStart"/>
+      <w:r>
+        <w:t>postgres</w:t>
+      </w:r>
+      <w:proofErr w:type="spellEnd"/>
+      <w:r>
+        <w:t xml:space="preserve">, </w:t>
+      </w:r>
+      <w:proofErr w:type="spellStart"/>
+      <w:r>
+        <w:t>service</w:t>
+      </w:r>
+      <w:proofErr w:type="spellEnd"/>
+      <w:r>
+        <w:t xml:space="preserve">, </w:t>
+      </w:r>
+      <w:proofErr w:type="spellStart"/>
+      <w:r>
+        <w:t>frontend</w:t>
+      </w:r>
+      <w:proofErr w:type="spellEnd"/>
+      <w:r>
+        <w:t xml:space="preserve">, </w:t>
+      </w:r>
+      <w:proofErr w:type="spellStart"/>
+      <w:r>
+        <w:t>prometheus</w:t>
+      </w:r>
+      <w:proofErr w:type="spellEnd"/>
+      <w:r>
+        <w:t xml:space="preserve">, </w:t>
+      </w:r>
+      <w:proofErr w:type="spellStart"/>
+      <w:r>
+        <w:t>grafana</w:t>
+      </w:r>
+      <w:proofErr w:type="spellEnd"/>
+      <w:r>
+        <w:t xml:space="preserve">); миграции базы данных — </w:t>
+      </w:r>
+      <w:proofErr w:type="spellStart"/>
+      <w:r>
+        <w:t>Alembic</w:t>
+      </w:r>
+      <w:proofErr w:type="spellEnd"/>
+      <w:r>
+        <w:t>.</w:t>
       </w:r>
     </w:p>
     <w:p>
@@ -3884,7 +5066,7 @@
         <w:jc w:val="both"/>
       </w:pPr>
       <w:r>
-        <w:t>Испытания проведены на прототипе системы, развёрнутом через Docker Compose на ПК x86-64 (Linux/Windows, Docker Desktop; ТЗ, п. 4.4.1) с подключением тестовой LLM через OpenAI-совместимый API (deepseek-ai/DeepSeek-V4-Flash). Тестовые данные — эталонные файлы Заказчика (data_proportional_prices.xlsx, Faked_List_proportional (2).xlsx) и бенчмарк из 25 вопросов с эталонными ответами. Оценка выполнялась автоматизированным прогоном бенчмарка (benchmark/run_first6.py и run_all.py): из эталонного и фактического ответов извлекается первое число и сравнивается с относительным допуском 1 %; вопросы без числового эталона исключаются из расчёта pass rate. Дополнительно выполнялись юнит- и интеграционные тесты (pytest, CI — GitHub Actions). Целевые значения приёмки заданы в таблице 3 ТЗ.</w:t>
+        <w:t>Испытания проведены на прототипе системы, развёрнутом через Docker Compose на ПК x86-64 (Linux/Windows, Docker Desktop; ТЗ, п. 4.4.1) с подключением тестовой LLM через OpenAI-совместимый API (deepseek-ai/DeepSeek-V4-Flash). Тестовые данные — эталонные файлы Заказчика (data_proportional_prices.xlsx, Faked_List_proportional (2).xlsx) и бенчмарк из 55 запросов с эталонными ответами. Оценка выполнялась автоматизированным прогоном бенчмарка (benchmark/run_first6.py и run_all.py): из эталонного и фактического ответов извлекается первое число и сравнивается с относительным допуском 1 %; вопросы без числового эталона исключаются из расчёта pass rate. Дополнительно выполнялись юнит- и интеграционные тесты (pytest, CI — GitHub Actions). Целевые значения приёмки заданы в таблице 3 ТЗ.</w:t>
       </w:r>
     </w:p>
     <w:p>
@@ -3936,11 +5118,11 @@
         <w:tblLook w:val="04A0" w:firstRow="1" w:lastRow="0" w:firstColumn="1" w:lastColumn="0" w:noHBand="0" w:noVBand="1"/>
       </w:tblPr>
       <w:tblGrid>
-        <w:gridCol w:w="598"/>
-        <w:gridCol w:w="2590"/>
-        <w:gridCol w:w="2087"/>
-        <w:gridCol w:w="2386"/>
-        <w:gridCol w:w="1694"/>
+        <w:gridCol w:w="600"/>
+        <w:gridCol w:w="2600"/>
+        <w:gridCol w:w="2100"/>
+        <w:gridCol w:w="2355"/>
+        <w:gridCol w:w="1700"/>
       </w:tblGrid>
       <w:tr>
         <w:trPr>
@@ -4218,15 +5400,8 @@
             </w:tcMar>
           </w:tcPr>
           <w:p>
-            <w:pPr>
-              <w:spacing w:line="240" w:lineRule="auto"/>
-            </w:pPr>
-            <w:r>
-              <w:rPr>
-                <w:sz w:val="22"/>
-                <w:szCs w:val="22"/>
-              </w:rPr>
-              <w:t>100 % — 5/5 на первых 5 вопросах (15.10.2026)</w:t>
+            <w:r>
+              <w:t>93 % — 51/55 на едином прогоне бенчмарка из 55 запросов</w:t>
             </w:r>
           </w:p>
         </w:tc>
@@ -4366,15 +5541,8 @@
             </w:tcMar>
           </w:tcPr>
           <w:p>
-            <w:pPr>
-              <w:spacing w:line="240" w:lineRule="auto"/>
-            </w:pPr>
-            <w:r>
-              <w:rPr>
-                <w:sz w:val="22"/>
-                <w:szCs w:val="22"/>
-              </w:rPr>
-              <w:t>100 % (lookup, aggregate, delta, минимумы/максимумы по листам)</w:t>
+            <w:r>
+              <w:t>100 % (контрольные, поиск цены); 94 % (средние, мин/макс); 83 % (сравнения и дельты, составные)</w:t>
             </w:r>
           </w:p>
         </w:tc>
@@ -4425,7 +5593,31 @@
           </w:tcPr>
           <w:p>
             <w:r>
-              <w:t>Преимущество относительно baseline Заказчика (PandasAI, OpenChatBI, GPT-5.2)</w:t>
+              <w:t xml:space="preserve">Преимущество относительно </w:t>
+            </w:r>
+            <w:proofErr w:type="spellStart"/>
+            <w:r>
+              <w:t>baseline</w:t>
+            </w:r>
+            <w:proofErr w:type="spellEnd"/>
+            <w:r>
+              <w:t xml:space="preserve"> Заказчика (</w:t>
+            </w:r>
+            <w:proofErr w:type="spellStart"/>
+            <w:r>
+              <w:t>PandasAI</w:t>
+            </w:r>
+            <w:proofErr w:type="spellEnd"/>
+            <w:r>
+              <w:t xml:space="preserve">, </w:t>
+            </w:r>
+            <w:proofErr w:type="spellStart"/>
+            <w:r>
+              <w:t>OpenChatBI</w:t>
+            </w:r>
+            <w:proofErr w:type="spellEnd"/>
+            <w:r>
+              <w:t>, GPT-5.2)</w:t>
             </w:r>
           </w:p>
         </w:tc>
@@ -4445,7 +5637,15 @@
           </w:tcPr>
           <w:p>
             <w:r>
-              <w:t>100 %; baseline по данным пилота Заказчика существенно ниже</w:t>
+              <w:t xml:space="preserve">100 %; </w:t>
+            </w:r>
+            <w:proofErr w:type="spellStart"/>
+            <w:r>
+              <w:t>baseline</w:t>
+            </w:r>
+            <w:proofErr w:type="spellEnd"/>
+            <w:r>
+              <w:t xml:space="preserve"> по данным пилота Заказчика существенно ниже</w:t>
             </w:r>
           </w:p>
         </w:tc>
@@ -4467,6 +5667,7 @@
           </w:tcPr>
           <w:p>
             <w:r>
+              <w:lastRenderedPageBreak/>
               <w:t>4</w:t>
             </w:r>
           </w:p>
@@ -4476,8 +5677,13 @@
             <w:tcW w:w="2600" w:type="dxa"/>
           </w:tcPr>
           <w:p>
-            <w:r>
-              <w:t>Автотесты: юнит, интеграционные, CI (таблица 11 ТЗ)</w:t>
+            <w:proofErr w:type="spellStart"/>
+            <w:r>
+              <w:t>Автотесты</w:t>
+            </w:r>
+            <w:proofErr w:type="spellEnd"/>
+            <w:r>
+              <w:t>: юнит, интеграционные, CI (таблица 11 ТЗ)</w:t>
             </w:r>
           </w:p>
         </w:tc>
@@ -4496,8 +5702,29 @@
             <w:tcW w:w="2355" w:type="dxa"/>
           </w:tcPr>
           <w:p>
-            <w:r>
-              <w:t>pytest + GitHub Actions — успешно</w:t>
+            <w:proofErr w:type="spellStart"/>
+            <w:r>
+              <w:t>pytest</w:t>
+            </w:r>
+            <w:proofErr w:type="spellEnd"/>
+            <w:r>
+              <w:t xml:space="preserve"> + </w:t>
+            </w:r>
+            <w:proofErr w:type="spellStart"/>
+            <w:r>
+              <w:t>GitHub</w:t>
+            </w:r>
+            <w:proofErr w:type="spellEnd"/>
+            <w:r>
+              <w:t xml:space="preserve"> </w:t>
+            </w:r>
+            <w:proofErr w:type="spellStart"/>
+            <w:r>
+              <w:t>Actions</w:t>
+            </w:r>
+            <w:proofErr w:type="spellEnd"/>
+            <w:r>
+              <w:t xml:space="preserve"> — успешно</w:t>
             </w:r>
           </w:p>
         </w:tc>
@@ -4530,13 +5757,10 @@
       <w:pPr>
         <w:pStyle w:val="a4"/>
         <w:ind w:firstLine="708"/>
-      </w:pPr>
-      <w:r>
-        <w:t xml:space="preserve">Прогон первых 5 вопросов бенчмарка (15.10.2026) дал 100 % правильных ответов при целевом значении не менее 80 %: подтверждены lookup (среднерыночная цена на лом </w:t>
-      </w:r>
-      <w:r>
-        <w:lastRenderedPageBreak/>
-        <w:t>твёрдых сплавов в декабре 2025 г. — 2 697 900 руб./тн), максимум по аукциону (лам латуни ЛАЖМц — 602 922 руб./тн), средняя по всем видам медного лома у Ферроком (696 625,15 руб./тн), дельта между минимальной и максимальной ценой (438 350,1 руб./тн) и минимум по листам (цинковый лом — 164 220 руб./тн). Время ответа варьируется от ~0,02 с (кэш/прямой SQL) до ~83 с (многошаговый вопрос) из-за обращений к LLM. Прогон golden-датасета из 10 вопросов (12.10.2026) не засчитан по технической причине — ошибка подключения к PostgreSQL тестового контура («couldn't get a connection after 30.00 sec»); после устранения проблемы прогон необходимо повторить. Полный прогон бенчмарка из 25 вопросов выполняется на этапе финальной приёмки. Практическая ценность решения подтверждается отказом от ручной агрегации данных и проверяемостью каждого ответа (SQL, источники, трасса).</w:t>
+        <w:jc w:val="both"/>
+      </w:pPr>
+      <w:r>
+        <w:t>Единый прогон бенчмарка из 55 запросов (5 контрольных от Заказчика + 50 реальных сценариев; контрольная группа — с допуском 1 %) дал 93 % правильных ответов (51 из 55) при целевом значении не менее 80 %: контрольные запросы Заказчика — 100 % (5/5), простой поиск цены — 100 % (14/14), средние и минимумы/максимумы по периодам — 94 % (17/18), сравнения и дельты — 83 % (10/12), составные запросы (поставщики + периоды) — 83 % (5/6). Подтверждены lookup (среднерыночная цена на лом твёрдых сплавов в декабре 2025 г. — 2 697 900 руб./тн), максимум по аукциону (лом латуни ЛАЖМц — 602 922 руб./тн), средняя по всем видам медного лома у Ферроком (696 625,15 руб./тн), дельта между минимальной и максимальной ценой (438 350,1 руб./тн) и минимум по листам (цинковый лом — 164 220 руб./тн). Среднее время ответа — около 35 с (медиана ~25–33 с, разброс от ~0,02 с для кэшированных запросов до ~90 с для многошаговых) из-за обращений к LLM; суммарный трафик — около 2 млн токенов (~36 тыс. на запрос). Четыре неуспешных запроса требуют доработки, каждая цифра ответа перепроверяема по источнику. Практическая ценность решения подтверждается отказом от ручной агрегации данных и проверяемостью каждого ответа (SQL, источники, трасса).</w:t>
       </w:r>
     </w:p>
     <w:p>
@@ -4559,7 +5783,15 @@
         <w:jc w:val="both"/>
       </w:pPr>
       <w:r>
-        <w:t>В ходе выполнения работы разработан и испытан прототип AI-агента (Excel-агент ЕВРАЗ) для ответов на аналитические вопросы по данным многолистовых Excel-файлов: выполнены постановка задачи и выбор архитектуры, подготовлены тестовый корпус и бенчмарк, реализованы модули предобработки и вычислений, агент, backend/API и веб-интерфейс, проведены испытания и подготовлена проектная документация.</w:t>
+        <w:t xml:space="preserve">В ходе выполнения работы разработан и испытан прототип AI-агента (Excel-агент ЕВРАЗ) для ответов на аналитические вопросы по данным многолистовых Excel-файлов: выполнены постановка задачи и выбор архитектуры, подготовлены тестовый корпус и бенчмарк, реализованы модули предобработки и вычислений, агент, </w:t>
+      </w:r>
+      <w:proofErr w:type="spellStart"/>
+      <w:r>
+        <w:t>backend</w:t>
+      </w:r>
+      <w:proofErr w:type="spellEnd"/>
+      <w:r>
+        <w:t>/API и веб-интерфейс, проведены испытания и подготовлена проектная документация.</w:t>
       </w:r>
     </w:p>
     <w:p>
@@ -4573,31 +5805,146 @@
     </w:p>
     <w:p>
       <w:pPr>
-        <w:pStyle w:val="a4"/>
-        <w:numPr>
-          <w:ilvl w:val="0"/>
-          <w:numId w:val="4"/>
-        </w:numPr>
+        <w:ind w:firstLine="708"/>
+        <w:jc w:val="both"/>
+      </w:pPr>
+      <w:r>
+        <w:t xml:space="preserve">1) </w:t>
+      </w:r>
+      <w:r>
+        <w:t xml:space="preserve">реализована модульная система «LLM + обвязка» на стеке Python 3.12, </w:t>
+      </w:r>
+      <w:proofErr w:type="spellStart"/>
+      <w:r>
+        <w:t>FastAPI</w:t>
+      </w:r>
+      <w:proofErr w:type="spellEnd"/>
+      <w:r>
+        <w:t xml:space="preserve">, </w:t>
+      </w:r>
+      <w:proofErr w:type="spellStart"/>
+      <w:r>
+        <w:t>LangGraph</w:t>
+      </w:r>
+      <w:proofErr w:type="spellEnd"/>
+      <w:r>
+        <w:t xml:space="preserve">, </w:t>
+      </w:r>
+      <w:proofErr w:type="spellStart"/>
+      <w:r>
+        <w:t>PostgreSQL</w:t>
+      </w:r>
+      <w:proofErr w:type="spellEnd"/>
+      <w:r>
+        <w:t xml:space="preserve"> 16, </w:t>
+      </w:r>
+      <w:proofErr w:type="spellStart"/>
+      <w:r>
+        <w:t>React</w:t>
+      </w:r>
+      <w:proofErr w:type="spellEnd"/>
+      <w:r>
+        <w:t>/</w:t>
+      </w:r>
+      <w:proofErr w:type="spellStart"/>
+      <w:r>
+        <w:t>TypeScript</w:t>
+      </w:r>
+      <w:proofErr w:type="spellEnd"/>
+      <w:r>
+        <w:t xml:space="preserve">, разворачиваемая через </w:t>
+      </w:r>
+      <w:proofErr w:type="spellStart"/>
+      <w:r>
+        <w:t>Docker</w:t>
+      </w:r>
+      <w:proofErr w:type="spellEnd"/>
+      <w:r>
+        <w:t xml:space="preserve"> </w:t>
+      </w:r>
+      <w:proofErr w:type="spellStart"/>
+      <w:r>
+        <w:t>Compose</w:t>
+      </w:r>
+      <w:proofErr w:type="spellEnd"/>
+      <w:r>
+        <w:t xml:space="preserve"> и сопровождаемая наблюдаемостью (</w:t>
+      </w:r>
+      <w:proofErr w:type="spellStart"/>
+      <w:r>
+        <w:t>Prometheus</w:t>
+      </w:r>
+      <w:proofErr w:type="spellEnd"/>
+      <w:r>
+        <w:t xml:space="preserve">, </w:t>
+      </w:r>
+      <w:proofErr w:type="spellStart"/>
+      <w:r>
+        <w:t>Grafana</w:t>
+      </w:r>
+      <w:proofErr w:type="spellEnd"/>
+      <w:r>
+        <w:t>);</w:t>
+      </w:r>
+    </w:p>
+    <w:p>
+      <w:pPr>
+        <w:ind w:firstLine="708"/>
+        <w:jc w:val="both"/>
+      </w:pPr>
+      <w:r>
+        <w:t>2) на бенчмарке из 55 запросов достигнута доля правильных ответов 93 % (51 из 55, единый прогон) при целевом значении не менее 80 % (таблица 3 ТЗ); расчёты выполняются проверенными read-only SQL-запросами, пользователю доступны SQL, источники и трасса шагов агента.</w:t>
+      </w:r>
+    </w:p>
+    <w:p>
+      <w:pPr>
         <w:ind w:firstLine="709"/>
         <w:jc w:val="both"/>
       </w:pPr>
       <w:r>
-        <w:t>реализована модульная система «LLM + обвязка» на стеке Python 3.12, FastAPI, LangGraph, PostgreSQL 16, React/TypeScript, разворачиваемая через Docker Compose и сопровождаемая наблюдаемостью (Prometheus, Grafana);</w:t>
-      </w:r>
-    </w:p>
-    <w:p>
-      <w:pPr>
-        <w:pStyle w:val="a4"/>
-        <w:numPr>
-          <w:ilvl w:val="0"/>
-          <w:numId w:val="4"/>
-        </w:numPr>
+        <w:t>Поставленные задачи выполнены полностью в объёме прототипа, предусмотренного ТЗ. Требование о доле правильных ответов не менее 80 % подтверждено на едином прогоне бенчмарка из 55 запросов (51/55 = 93 %); контрольная группа запросов Заказчика пройдена полностью (5/5 = 100 %).</w:t>
+      </w:r>
+    </w:p>
+    <w:p>
+      <w:pPr>
         <w:ind w:firstLine="709"/>
         <w:jc w:val="both"/>
       </w:pPr>
       <w:r>
-        <w:t>на бенчмарке Заказчика (первые 5 вопросов) достигнута доля правильных ответов 100 % при целевом значении не менее 80 % (таблица 3 ТЗ); расчёты выполняются проверенными read-only SQL-запросами, пользователю доступны SQL, источники и трасса шагов агента.</w:t>
-      </w:r>
+        <w:t>Рекомендации по внедрению и дальнейшему развитию:</w:t>
+      </w:r>
+    </w:p>
+    <w:p>
+      <w:pPr>
+        <w:ind w:firstLine="708"/>
+        <w:jc w:val="both"/>
+      </w:pPr>
+      <w:r>
+        <w:t>- подключить к обвязке корпоративную LLM Заказчика (OpenAI-совместимый API с tool calling) в контуре ЕВРАЗ и провести повторный прогон бенчмарка и разобрать 4 неуспешных запроса с анализом ошибок по трассам (цель — точность выше 93 %);</w:t>
+      </w:r>
+    </w:p>
+    <w:p>
+      <w:pPr>
+        <w:ind w:firstLine="708"/>
+        <w:jc w:val="both"/>
+      </w:pPr>
+      <w:r>
+        <w:t>- расширить корпус тестовых файлов (новые макеты листов, другие периоды и виды данных), внедрить OCR для печатных форм и расширить бенчмарк новыми запросами для регрессионного контроля качества.</w:t>
+      </w:r>
+    </w:p>
+    <w:p>
+      <w:pPr>
+        <w:pStyle w:val="1"/>
+        <w:pageBreakBefore/>
+        <w:spacing w:after="240"/>
+        <w:jc w:val="center"/>
+      </w:pPr>
+      <w:bookmarkStart w:id="21" w:name="_Toc243485771"/>
+      <w:r>
+        <w:lastRenderedPageBreak/>
+        <w:t>СПИСОК ИСПОЛЬЗОВАННЫХ ИСТОЧНИКОВ</w:t>
+      </w:r>
+      <w:bookmarkEnd w:id="21"/>
     </w:p>
     <w:p>
       <w:pPr>
@@ -4605,16 +5952,13 @@
         <w:jc w:val="both"/>
       </w:pPr>
       <w:r>
-        <w:t>Поставленные задачи выполнены полностью в объёме прототипа, предусмотренного ТЗ. Требование о доле правильных ответов не менее 80 % подтверждено на первых вопросах бенчмарка; полный прогон бенчмарка из 25 вопросов и прогон golden-датасета выполняются на этапе финальной приёмки после устранения проблемы подключения тестовой БД.</w:t>
-      </w:r>
-    </w:p>
-    <w:p>
-      <w:pPr>
-        <w:ind w:firstLine="709"/>
-        <w:jc w:val="both"/>
-      </w:pPr>
-      <w:r>
-        <w:t>Рекомендации по внедрению и дальнейшему развитию:</w:t>
+        <w:t xml:space="preserve">При выполнении работы и подготовке отчёта использованы следующие </w:t>
+      </w:r>
+      <w:r>
+        <w:t>источники</w:t>
+      </w:r>
+      <w:r>
+        <w:t>:</w:t>
       </w:r>
     </w:p>
     <w:p>
@@ -4628,7 +5972,15 @@
         <w:jc w:val="both"/>
       </w:pPr>
       <w:r>
-        <w:t>подключить к обвязке корпоративную LLM Заказчика (OpenAI-совместимый API с tool calling) в контуре ЕВРАЗ и провести полный прогон бенчмарка из 25 вопросов с анализом ошибок по трассам;</w:t>
+        <w:t>Техническое задание «Разработка прототипа AI-агента для ответов на аналитические вопросы по данным многолистовых Excel-файлов» (ТЗ_ЕВРАЗ_v3 (5).</w:t>
+      </w:r>
+      <w:proofErr w:type="spellStart"/>
+      <w:r>
+        <w:t>docx</w:t>
+      </w:r>
+      <w:proofErr w:type="spellEnd"/>
+      <w:r>
+        <w:t>, 2026 г.);</w:t>
       </w:r>
     </w:p>
     <w:p>
@@ -4642,36 +5994,7 @@
         <w:jc w:val="both"/>
       </w:pPr>
       <w:r>
-        <w:t>расширить корпус тестовых файлов (новые макеты листов, другие периоды и виды данных), внедрить OCR для печатных форм и продолжить накопление golden-датасета для регрессионного контроля качества.</w:t>
-      </w:r>
-    </w:p>
-    <w:p>
-      <w:pPr>
-        <w:pStyle w:val="1"/>
-        <w:pageBreakBefore/>
-        <w:spacing w:after="240"/>
-        <w:jc w:val="center"/>
-      </w:pPr>
-      <w:bookmarkStart w:id="21" w:name="_Toc243485771"/>
-      <w:r>
-        <w:lastRenderedPageBreak/>
-        <w:t>СПИСОК ИСПОЛЬЗОВАННЫХ ИСТОЧНИКОВ</w:t>
-      </w:r>
-      <w:bookmarkEnd w:id="21"/>
-    </w:p>
-    <w:p>
-      <w:pPr>
-        <w:ind w:firstLine="709"/>
-        <w:jc w:val="both"/>
-      </w:pPr>
-      <w:r>
-        <w:t xml:space="preserve">При выполнении работы и подготовке отчёта использованы следующие </w:t>
-      </w:r>
-      <w:r>
-        <w:t>источники</w:t>
-      </w:r>
-      <w:r>
-        <w:t>:</w:t>
+        <w:t>Программа и методика испытаний «Разработка прототипа AI-агента для ответов на аналитические вопросы по данным многолистовых Excel-файлов» (подготовлена в рамках этапа 5, 2026 г.);</w:t>
       </w:r>
     </w:p>
     <w:p>
@@ -4685,7 +6008,7 @@
         <w:jc w:val="both"/>
       </w:pPr>
       <w:r>
-        <w:t>Техническое задание «Разработка прототипа AI-агента для ответов на аналитические вопросы по данным многолистовых Excel-файлов» (ТЗ_ЕВРАЗ_v3 (5).docx, 2026 г.);</w:t>
+        <w:t>ГОСТ 19.201-78 «Единая система программной документации. Техническое задание. Требования к содержанию и оформлению»;</w:t>
       </w:r>
     </w:p>
     <w:p>
@@ -4699,7 +6022,7 @@
         <w:jc w:val="both"/>
       </w:pPr>
       <w:r>
-        <w:t>Программа и методика испытаний «Разработка прототипа AI-агента для ответов на аналитические вопросы по данным многолистовых Excel-файлов» (подготовлена в рамках этапа 5, 2026 г.);</w:t>
+        <w:t>ГОСТ 19.301-79 «Единая система программной документации. Программа и методика испытаний. Требования к содержанию и оформлению»;</w:t>
       </w:r>
     </w:p>
     <w:p>
@@ -4713,7 +6036,7 @@
         <w:jc w:val="both"/>
       </w:pPr>
       <w:r>
-        <w:t>ГОСТ 19.201-78 «Единая система программной документации. Техническое задание. Требования к содержанию и оформлению»;</w:t>
+        <w:t>ГОСТ 7.32-2017 «Система стандартов по информации, библиотечному и издательскому делу. Отчёт о научно-исследовательской работе. Структура и правила оформления»;</w:t>
       </w:r>
     </w:p>
     <w:p>
@@ -4727,7 +6050,7 @@
         <w:jc w:val="both"/>
       </w:pPr>
       <w:r>
-        <w:t>ГОСТ 19.301-79 «Единая система программной документации. Программа и методика испытаний. Требования к содержанию и оформлению»;</w:t>
+        <w:t>ГОСТ Р 2.105-2019 «Единая система конструкторской документации. Общие требования к текстовым документам».</w:t>
       </w:r>
     </w:p>
     <w:p>
@@ -4741,35 +6064,31 @@
         <w:jc w:val="both"/>
       </w:pPr>
       <w:r>
-        <w:t>ГОСТ 7.32-2017 «Система стандартов по информации, библиотечному и издательскому делу. Отчёт о научно-исследовательской работе. Структура и правила оформления»;</w:t>
-      </w:r>
-    </w:p>
-    <w:p>
-      <w:pPr>
-        <w:pStyle w:val="a4"/>
-        <w:numPr>
-          <w:ilvl w:val="0"/>
-          <w:numId w:val="3"/>
-        </w:numPr>
-        <w:ind w:firstLine="709"/>
-        <w:jc w:val="both"/>
-      </w:pPr>
-      <w:r>
-        <w:t>ГОСТ Р 2.105-2019 «Единая система конструкторской документации. Общие требования к текстовым документам».</w:t>
-      </w:r>
-    </w:p>
-    <w:p>
-      <w:pPr>
-        <w:pStyle w:val="a4"/>
-        <w:numPr>
-          <w:ilvl w:val="0"/>
-          <w:numId w:val="3"/>
-        </w:numPr>
-        <w:ind w:firstLine="709"/>
-        <w:jc w:val="both"/>
-      </w:pPr>
-      <w:r>
-        <w:t>Материалы ЕВРАЗ «Демо работы AI-агента с Excel-файлами» — постановка задачи, типы запросов, baseline связок PandasAI / OpenChatBI / GPT-5.2;</w:t>
+        <w:t xml:space="preserve">Материалы ЕВРАЗ «Демо работы AI-агента с Excel-файлами» — постановка задачи, типы запросов, </w:t>
+      </w:r>
+      <w:proofErr w:type="spellStart"/>
+      <w:r>
+        <w:t>baseline</w:t>
+      </w:r>
+      <w:proofErr w:type="spellEnd"/>
+      <w:r>
+        <w:t xml:space="preserve"> связок </w:t>
+      </w:r>
+      <w:proofErr w:type="spellStart"/>
+      <w:r>
+        <w:t>PandasAI</w:t>
+      </w:r>
+      <w:proofErr w:type="spellEnd"/>
+      <w:r>
+        <w:t xml:space="preserve"> / </w:t>
+      </w:r>
+      <w:proofErr w:type="spellStart"/>
+      <w:r>
+        <w:t>OpenChatBI</w:t>
+      </w:r>
+      <w:proofErr w:type="spellEnd"/>
+      <w:r>
+        <w:t xml:space="preserve"> / GPT-5.2;</w:t>
       </w:r>
     </w:p>
     <w:p>
@@ -4786,13 +6105,73 @@
         </w:rPr>
       </w:pPr>
       <w:r>
-        <w:t xml:space="preserve">Публикации по Tabular QA: Herzig J. et al. </w:t>
+        <w:t xml:space="preserve">Публикации по </w:t>
+      </w:r>
+      <w:proofErr w:type="spellStart"/>
+      <w:r>
+        <w:t>Tabular</w:t>
+      </w:r>
+      <w:proofErr w:type="spellEnd"/>
+      <w:r>
+        <w:t xml:space="preserve"> QA: </w:t>
+      </w:r>
+      <w:proofErr w:type="spellStart"/>
+      <w:r>
+        <w:t>Herzig</w:t>
+      </w:r>
+      <w:proofErr w:type="spellEnd"/>
+      <w:r>
+        <w:t xml:space="preserve"> J. </w:t>
+      </w:r>
+      <w:proofErr w:type="spellStart"/>
+      <w:r>
+        <w:t>et</w:t>
+      </w:r>
+      <w:proofErr w:type="spellEnd"/>
+      <w:r>
+        <w:t xml:space="preserve"> </w:t>
+      </w:r>
+      <w:proofErr w:type="spellStart"/>
+      <w:r>
+        <w:t>al</w:t>
+      </w:r>
+      <w:proofErr w:type="spellEnd"/>
+      <w:r>
+        <w:t xml:space="preserve">. </w:t>
       </w:r>
       <w:r>
         <w:rPr>
           <w:lang w:val="en-US"/>
         </w:rPr>
-        <w:t>«TaPas: Weakly Supervised Table Parsing via Pre-training» (ACL, 2020); Cheng Z. et al. «HiTab: A Hierarchical Table Dataset for Question Answering and Natural Language Generation» (ACL, 2022); «Binding Language Models in Symbolic Languages» (ICLR, 2023); Wang Z. et al. «Chain-of-Table: Evolving Tables in the Reasoning Chain for Table Understanding» (ICLR, 2024).</w:t>
+        <w:t>«</w:t>
+      </w:r>
+      <w:proofErr w:type="spellStart"/>
+      <w:r>
+        <w:rPr>
+          <w:lang w:val="en-US"/>
+        </w:rPr>
+        <w:t>TaPas</w:t>
+      </w:r>
+      <w:proofErr w:type="spellEnd"/>
+      <w:r>
+        <w:rPr>
+          <w:lang w:val="en-US"/>
+        </w:rPr>
+        <w:t>: Weakly Supervised Table Parsing via Pre-training» (ACL, 2020); Cheng Z. et al. «</w:t>
+      </w:r>
+      <w:proofErr w:type="spellStart"/>
+      <w:r>
+        <w:rPr>
+          <w:lang w:val="en-US"/>
+        </w:rPr>
+        <w:t>HiTab</w:t>
+      </w:r>
+      <w:proofErr w:type="spellEnd"/>
+      <w:r>
+        <w:rPr>
+          <w:lang w:val="en-US"/>
+        </w:rPr>
+        <w:t>: A Hierarchical Table Dataset for Question Answering and Natural Language Generation» (ACL, 2022); «Binding Language Models in Symbolic Languages» (ICLR, 2023); Wang Z. et al. «Chain-of-Table: Evolving Tables in the Reasoning Chain for Table Understanding» (ICLR, 2024).</w:t>
       </w:r>
     </w:p>
     <w:p>
@@ -4815,7 +6194,91 @@
         <w:rPr>
           <w:lang w:val="en-US"/>
         </w:rPr>
-        <w:t xml:space="preserve"> Python, FastAPI, SQLAlchemy 2.0, LangGraph, langchain-openai, openpyxl, pandas, PostgreSQL, React, Vite, Chart.js;</w:t>
+        <w:t xml:space="preserve"> Python, </w:t>
+      </w:r>
+      <w:proofErr w:type="spellStart"/>
+      <w:r>
+        <w:rPr>
+          <w:lang w:val="en-US"/>
+        </w:rPr>
+        <w:t>FastAPI</w:t>
+      </w:r>
+      <w:proofErr w:type="spellEnd"/>
+      <w:r>
+        <w:rPr>
+          <w:lang w:val="en-US"/>
+        </w:rPr>
+        <w:t xml:space="preserve">, </w:t>
+      </w:r>
+      <w:proofErr w:type="spellStart"/>
+      <w:r>
+        <w:rPr>
+          <w:lang w:val="en-US"/>
+        </w:rPr>
+        <w:t>SQLAlchemy</w:t>
+      </w:r>
+      <w:proofErr w:type="spellEnd"/>
+      <w:r>
+        <w:rPr>
+          <w:lang w:val="en-US"/>
+        </w:rPr>
+        <w:t xml:space="preserve"> 2.0, </w:t>
+      </w:r>
+      <w:proofErr w:type="spellStart"/>
+      <w:r>
+        <w:rPr>
+          <w:lang w:val="en-US"/>
+        </w:rPr>
+        <w:t>LangGraph</w:t>
+      </w:r>
+      <w:proofErr w:type="spellEnd"/>
+      <w:r>
+        <w:rPr>
+          <w:lang w:val="en-US"/>
+        </w:rPr>
+        <w:t xml:space="preserve">, </w:t>
+      </w:r>
+      <w:proofErr w:type="spellStart"/>
+      <w:r>
+        <w:rPr>
+          <w:lang w:val="en-US"/>
+        </w:rPr>
+        <w:t>langchain-openai</w:t>
+      </w:r>
+      <w:proofErr w:type="spellEnd"/>
+      <w:r>
+        <w:rPr>
+          <w:lang w:val="en-US"/>
+        </w:rPr>
+        <w:t xml:space="preserve">, </w:t>
+      </w:r>
+      <w:proofErr w:type="spellStart"/>
+      <w:r>
+        <w:rPr>
+          <w:lang w:val="en-US"/>
+        </w:rPr>
+        <w:t>openpyxl</w:t>
+      </w:r>
+      <w:proofErr w:type="spellEnd"/>
+      <w:r>
+        <w:rPr>
+          <w:lang w:val="en-US"/>
+        </w:rPr>
+        <w:t xml:space="preserve">, pandas, PostgreSQL, React, </w:t>
+      </w:r>
+      <w:proofErr w:type="spellStart"/>
+      <w:r>
+        <w:rPr>
+          <w:lang w:val="en-US"/>
+        </w:rPr>
+        <w:t>Vite</w:t>
+      </w:r>
+      <w:proofErr w:type="spellEnd"/>
+      <w:r>
+        <w:rPr>
+          <w:lang w:val="en-US"/>
+        </w:rPr>
+        <w:t>, Chart.js;</w:t>
       </w:r>
     </w:p>
     <w:p>
@@ -4870,7 +6333,7 @@
           <w:lang w:val="en-US"/>
         </w:rPr>
         <w:drawing>
-          <wp:inline distT="0" distB="0" distL="0" distR="0" wp14:anchorId="73A73187" wp14:editId="3577F320">
+          <wp:inline distT="0" distB="0" distL="0" distR="0" wp14:anchorId="4A304C18" wp14:editId="39E40AAA">
             <wp:extent cx="2965832" cy="8176260"/>
             <wp:effectExtent l="0" t="0" r="6350" b="0"/>
             <wp:docPr id="3" name="Рисунок 3"/>
@@ -4930,7 +6393,31 @@
         <w:jc w:val="center"/>
       </w:pPr>
       <w:r>
-        <w:t>Рисунок А.1 — Пайплайн обработки Excel-файлов (источник: diagrams/excel_ingestion.mmd)</w:t>
+        <w:t xml:space="preserve">Рисунок А.1 — </w:t>
+      </w:r>
+      <w:proofErr w:type="spellStart"/>
+      <w:r>
+        <w:t>Пайплайн</w:t>
+      </w:r>
+      <w:proofErr w:type="spellEnd"/>
+      <w:r>
+        <w:t xml:space="preserve"> обработки Excel-файлов (источник: </w:t>
+      </w:r>
+      <w:proofErr w:type="spellStart"/>
+      <w:r>
+        <w:t>diagrams</w:t>
+      </w:r>
+      <w:proofErr w:type="spellEnd"/>
+      <w:r>
+        <w:t>/</w:t>
+      </w:r>
+      <w:proofErr w:type="spellStart"/>
+      <w:r>
+        <w:t>excel_ingestion.mmd</w:t>
+      </w:r>
+      <w:proofErr w:type="spellEnd"/>
+      <w:r>
+        <w:t>)</w:t>
       </w:r>
     </w:p>
     <w:p>
@@ -4963,12 +6450,106 @@
       <w:pPr>
         <w:pStyle w:val="a4"/>
         <w:ind w:firstLine="708"/>
-        <w:rPr>
-          <w:lang w:val="en-US"/>
-        </w:rPr>
-      </w:pPr>
-      <w:r>
-        <w:t>Инструкция по установке, запуску и работе приведена в INSTRUCTIONS.md и README.md репозитория: 1) подготовить .env (LLM_BASE_URL, LLM_API_KEY, LLM_MODEL_PRIMARY, POSTGRES_*); 2) выполнить docker compose up --build и alembic upgrade head; 3) открыть веб-интерфейс на порту 8080 и загрузить Excel-файл на странице «Файлы»; 4) после статуса ready задать вопрос в «Чате»; 5) просмотреть ответ, SQL, источники и трассу шагов агента; 6) при необходимости построить график (кнопка в интерфейсе или POST /ask/chart). Системные требования: ПК x86-64, 8 ГБ ОЗУ, 100 ГБ HDD, Docker 20+ (ТЗ, п. 4.4).</w:t>
+        <w:jc w:val="both"/>
+      </w:pPr>
+      <w:r>
+        <w:t>Инструкция по установке, запуску и работе приведена в INSTRUCTIONS.md и README.md репозитория: 1) подготовить .</w:t>
+      </w:r>
+      <w:proofErr w:type="spellStart"/>
+      <w:r>
+        <w:t>env</w:t>
+      </w:r>
+      <w:proofErr w:type="spellEnd"/>
+      <w:r>
+        <w:t xml:space="preserve"> (LLM_BASE_URL, LLM_API_KEY, LLM_MODEL_PRIMARY, POSTGRES_*); 2) выполнить </w:t>
+      </w:r>
+      <w:proofErr w:type="spellStart"/>
+      <w:r>
+        <w:t>docker</w:t>
+      </w:r>
+      <w:proofErr w:type="spellEnd"/>
+      <w:r>
+        <w:t xml:space="preserve"> </w:t>
+      </w:r>
+      <w:proofErr w:type="spellStart"/>
+      <w:r>
+        <w:t>compose</w:t>
+      </w:r>
+      <w:proofErr w:type="spellEnd"/>
+      <w:r>
+        <w:t xml:space="preserve"> </w:t>
+      </w:r>
+      <w:proofErr w:type="spellStart"/>
+      <w:r>
+        <w:t>up</w:t>
+      </w:r>
+      <w:proofErr w:type="spellEnd"/>
+      <w:r>
+        <w:t xml:space="preserve"> --</w:t>
+      </w:r>
+      <w:proofErr w:type="spellStart"/>
+      <w:r>
+        <w:t>build</w:t>
+      </w:r>
+      <w:proofErr w:type="spellEnd"/>
+      <w:r>
+        <w:t xml:space="preserve"> и </w:t>
+      </w:r>
+      <w:proofErr w:type="spellStart"/>
+      <w:r>
+        <w:t>alembic</w:t>
+      </w:r>
+      <w:proofErr w:type="spellEnd"/>
+      <w:r>
+        <w:t xml:space="preserve"> </w:t>
+      </w:r>
+      <w:proofErr w:type="spellStart"/>
+      <w:r>
+        <w:t>upgrade</w:t>
+      </w:r>
+      <w:proofErr w:type="spellEnd"/>
+      <w:r>
+        <w:t xml:space="preserve"> </w:t>
+      </w:r>
+      <w:proofErr w:type="spellStart"/>
+      <w:r>
+        <w:t>head</w:t>
+      </w:r>
+      <w:proofErr w:type="spellEnd"/>
+      <w:r>
+        <w:t xml:space="preserve">; 3) открыть веб-интерфейс на порту 8080 и загрузить Excel-файл на странице «Файлы»; 4) после статуса </w:t>
+      </w:r>
+      <w:proofErr w:type="spellStart"/>
+      <w:r>
+        <w:t>ready</w:t>
+      </w:r>
+      <w:proofErr w:type="spellEnd"/>
+      <w:r>
+        <w:t xml:space="preserve"> задать вопрос в «Чате»; 5) просмотреть ответ, SQL, источники и трассу шагов агента; 6) при необходимости построить график (кнопка в интерфейсе или POST /</w:t>
+      </w:r>
+      <w:proofErr w:type="spellStart"/>
+      <w:r>
+        <w:t>ask</w:t>
+      </w:r>
+      <w:proofErr w:type="spellEnd"/>
+      <w:r>
+        <w:t>/</w:t>
+      </w:r>
+      <w:proofErr w:type="spellStart"/>
+      <w:r>
+        <w:t>chart</w:t>
+      </w:r>
+      <w:proofErr w:type="spellEnd"/>
+      <w:r>
+        <w:t xml:space="preserve">). Системные требования: ПК x86-64, 8 ГБ ОЗУ, 100 ГБ HDD, </w:t>
+      </w:r>
+      <w:proofErr w:type="spellStart"/>
+      <w:r>
+        <w:t>Docker</w:t>
+      </w:r>
+      <w:proofErr w:type="spellEnd"/>
+      <w:r>
+        <w:t xml:space="preserve"> 20+ (ТЗ, п. 4.4).</w:t>
       </w:r>
     </w:p>
     <w:p>
@@ -5481,7 +7062,25 @@
                 <w:szCs w:val="22"/>
                 <w:lang w:val="en-US"/>
               </w:rPr>
-              <w:t xml:space="preserve"> pg_trgm)</w:t>
+              <w:t xml:space="preserve"> </w:t>
+            </w:r>
+            <w:proofErr w:type="spellStart"/>
+            <w:r>
+              <w:rPr>
+                <w:sz w:val="22"/>
+                <w:szCs w:val="22"/>
+                <w:lang w:val="en-US"/>
+              </w:rPr>
+              <w:t>pg_trgm</w:t>
+            </w:r>
+            <w:proofErr w:type="spellEnd"/>
+            <w:r>
+              <w:rPr>
+                <w:sz w:val="22"/>
+                <w:szCs w:val="22"/>
+                <w:lang w:val="en-US"/>
+              </w:rPr>
+              <w:t>)</w:t>
             </w:r>
           </w:p>
         </w:tc>
@@ -5561,8 +7160,45 @@
             <w:tcW w:w="3300" w:type="dxa"/>
           </w:tcPr>
           <w:p>
-            <w:r>
-              <w:t>Backend-сервис FastAPI (uvicorn) + веб-интерфейс React (Nginx)</w:t>
+            <w:proofErr w:type="spellStart"/>
+            <w:r>
+              <w:t>Backend</w:t>
+            </w:r>
+            <w:proofErr w:type="spellEnd"/>
+            <w:r>
+              <w:t xml:space="preserve">-сервис </w:t>
+            </w:r>
+            <w:proofErr w:type="spellStart"/>
+            <w:r>
+              <w:t>FastAPI</w:t>
+            </w:r>
+            <w:proofErr w:type="spellEnd"/>
+            <w:r>
+              <w:t xml:space="preserve"> (</w:t>
+            </w:r>
+            <w:proofErr w:type="spellStart"/>
+            <w:r>
+              <w:t>uvicorn</w:t>
+            </w:r>
+            <w:proofErr w:type="spellEnd"/>
+            <w:r>
+              <w:t xml:space="preserve">) + веб-интерфейс </w:t>
+            </w:r>
+            <w:proofErr w:type="spellStart"/>
+            <w:r>
+              <w:t>React</w:t>
+            </w:r>
+            <w:proofErr w:type="spellEnd"/>
+            <w:r>
+              <w:t xml:space="preserve"> (</w:t>
+            </w:r>
+            <w:proofErr w:type="spellStart"/>
+            <w:r>
+              <w:t>Nginx</w:t>
+            </w:r>
+            <w:proofErr w:type="spellEnd"/>
+            <w:r>
+              <w:t>)</w:t>
             </w:r>
           </w:p>
         </w:tc>
@@ -5662,14 +7298,30 @@
               </w:rPr>
               <w:t xml:space="preserve">, </w:t>
             </w:r>
+            <w:proofErr w:type="spellStart"/>
             <w:r>
               <w:t>напр</w:t>
             </w:r>
+            <w:proofErr w:type="spellEnd"/>
             <w:r>
               <w:rPr>
                 <w:lang w:val="en-US"/>
               </w:rPr>
-              <w:t>. deepseek-ai/DeepSeek-V4-Flash</w:t>
+              <w:t xml:space="preserve">. </w:t>
+            </w:r>
+            <w:proofErr w:type="spellStart"/>
+            <w:r>
+              <w:rPr>
+                <w:lang w:val="en-US"/>
+              </w:rPr>
+              <w:t>deepseek</w:t>
+            </w:r>
+            <w:proofErr w:type="spellEnd"/>
+            <w:r>
+              <w:rPr>
+                <w:lang w:val="en-US"/>
+              </w:rPr>
+              <w:t>-ai/DeepSeek-V4-Flash</w:t>
             </w:r>
           </w:p>
         </w:tc>
@@ -5787,6 +7439,118 @@
 <file path=word/numbering.xml><?xml version="1.0" encoding="utf-8"?>
 <w:numbering xmlns:wpc="http://schemas.microsoft.com/office/word/2010/wordprocessingCanvas" xmlns:cx="http://schemas.microsoft.com/office/drawing/2014/chartex" xmlns:cx1="http://schemas.microsoft.com/office/drawing/2015/9/8/chartex" xmlns:cx2="http://schemas.microsoft.com/office/drawing/2015/10/21/chartex" xmlns:cx3="http://schemas.microsoft.com/office/drawing/2016/5/9/chartex" xmlns:cx4="http://schemas.microsoft.com/office/drawing/2016/5/10/chartex" xmlns:cx5="http://schemas.microsoft.com/office/drawing/2016/5/11/chartex" xmlns:cx6="http://schemas.microsoft.com/office/drawing/2016/5/12/chartex" xmlns:cx7="http://schemas.microsoft.com/office/drawing/2016/5/13/chartex" xmlns:cx8="http://schemas.microsoft.com/office/drawing/2016/5/14/chartex" xmlns:mc="http://schemas.openxmlformats.org/markup-compatibility/2006" xmlns:aink="http://schemas.microsoft.com/office/drawing/2016/ink" xmlns:am3d="http://schemas.microsoft.com/office/drawing/2017/model3d" xmlns:o="urn:schemas-microsoft-com:office:office" xmlns:oel="http://schemas.microsoft.com/office/2019/extlst" xmlns:r="http://schemas.openxmlformats.org/officeDocument/2006/relationships" xmlns:m="http://schemas.openxmlformats.org/officeDocument/2006/math" xmlns:v="urn:schemas-microsoft-com:vml" xmlns:wp14="http://schemas.microsoft.com/office/word/2010/wordprocessingDrawing" xmlns:wp="http://schemas.openxmlformats.org/drawingml/2006/wordprocessingDrawing" xmlns:w10="urn:schemas-microsoft-com:office:word" xmlns:w="http://schemas.openxmlformats.org/wordprocessingml/2006/main" xmlns:w14="http://schemas.microsoft.com/office/word/2010/wordml" xmlns:w15="http://schemas.microsoft.com/office/word/2012/wordml" xmlns:w16cex="http://schemas.microsoft.com/office/word/2018/wordml/cex" xmlns:w16cid="http://schemas.microsoft.com/office/word/2016/wordml/cid" xmlns:w16="http://schemas.microsoft.com/office/word/2018/wordml" xmlns:w16sdtdh="http://schemas.microsoft.com/office/word/2020/wordml/sdtdatahash" xmlns:w16se="http://schemas.microsoft.com/office/word/2015/wordml/symex" xmlns:wpg="http://schemas.microsoft.com/office/word/2010/wordprocessingGroup" xmlns:wpi="http://schemas.microsoft.com/office/word/2010/wordprocessingInk" xmlns:wne="http://schemas.microsoft.com/office/word/2006/wordml" xmlns:wps="http://schemas.microsoft.com/office/word/2010/wordprocessingShape" mc:Ignorable="w14 w15 w16se w16cid w16 w16cex w16sdtdh wp14">
   <w:abstractNum w:abstractNumId="0" w15:restartNumberingAfterBreak="0">
+    <w:nsid w:val="242F5C3C"/>
+    <w:multiLevelType w:val="hybridMultilevel"/>
+    <w:tmpl w:val="D6482D0A"/>
+    <w:lvl w:ilvl="0" w:tplc="1A626922">
+      <w:numFmt w:val="bullet"/>
+      <w:lvlText w:val="-"/>
+      <w:lvlJc w:val="left"/>
+      <w:pPr>
+        <w:ind w:left="720" w:hanging="360"/>
+      </w:pPr>
+      <w:rPr>
+        <w:rFonts w:ascii="Times New Roman" w:eastAsia="Times New Roman" w:hAnsi="Times New Roman" w:cs="Times New Roman" w:hint="default"/>
+      </w:rPr>
+    </w:lvl>
+    <w:lvl w:ilvl="1" w:tplc="04190003" w:tentative="1">
+      <w:start w:val="1"/>
+      <w:numFmt w:val="bullet"/>
+      <w:lvlText w:val="o"/>
+      <w:lvlJc w:val="left"/>
+      <w:pPr>
+        <w:ind w:left="1440" w:hanging="360"/>
+      </w:pPr>
+      <w:rPr>
+        <w:rFonts w:ascii="Courier New" w:hAnsi="Courier New" w:cs="Courier New" w:hint="default"/>
+      </w:rPr>
+    </w:lvl>
+    <w:lvl w:ilvl="2" w:tplc="04190005" w:tentative="1">
+      <w:start w:val="1"/>
+      <w:numFmt w:val="bullet"/>
+      <w:lvlText w:val=""/>
+      <w:lvlJc w:val="left"/>
+      <w:pPr>
+        <w:ind w:left="2160" w:hanging="360"/>
+      </w:pPr>
+      <w:rPr>
+        <w:rFonts w:ascii="Wingdings" w:hAnsi="Wingdings" w:hint="default"/>
+      </w:rPr>
+    </w:lvl>
+    <w:lvl w:ilvl="3" w:tplc="04190001" w:tentative="1">
+      <w:start w:val="1"/>
+      <w:numFmt w:val="bullet"/>
+      <w:lvlText w:val=""/>
+      <w:lvlJc w:val="left"/>
+      <w:pPr>
+        <w:ind w:left="2880" w:hanging="360"/>
+      </w:pPr>
+      <w:rPr>
+        <w:rFonts w:ascii="Symbol" w:hAnsi="Symbol" w:hint="default"/>
+      </w:rPr>
+    </w:lvl>
+    <w:lvl w:ilvl="4" w:tplc="04190003" w:tentative="1">
+      <w:start w:val="1"/>
+      <w:numFmt w:val="bullet"/>
+      <w:lvlText w:val="o"/>
+      <w:lvlJc w:val="left"/>
+      <w:pPr>
+        <w:ind w:left="3600" w:hanging="360"/>
+      </w:pPr>
+      <w:rPr>
+        <w:rFonts w:ascii="Courier New" w:hAnsi="Courier New" w:cs="Courier New" w:hint="default"/>
+      </w:rPr>
+    </w:lvl>
+    <w:lvl w:ilvl="5" w:tplc="04190005" w:tentative="1">
+      <w:start w:val="1"/>
+      <w:numFmt w:val="bullet"/>
+      <w:lvlText w:val=""/>
+      <w:lvlJc w:val="left"/>
+      <w:pPr>
+        <w:ind w:left="4320" w:hanging="360"/>
+      </w:pPr>
+      <w:rPr>
+        <w:rFonts w:ascii="Wingdings" w:hAnsi="Wingdings" w:hint="default"/>
+      </w:rPr>
+    </w:lvl>
+    <w:lvl w:ilvl="6" w:tplc="04190001" w:tentative="1">
+      <w:start w:val="1"/>
+      <w:numFmt w:val="bullet"/>
+      <w:lvlText w:val=""/>
+      <w:lvlJc w:val="left"/>
+      <w:pPr>
+        <w:ind w:left="5040" w:hanging="360"/>
+      </w:pPr>
+      <w:rPr>
+        <w:rFonts w:ascii="Symbol" w:hAnsi="Symbol" w:hint="default"/>
+      </w:rPr>
+    </w:lvl>
+    <w:lvl w:ilvl="7" w:tplc="04190003" w:tentative="1">
+      <w:start w:val="1"/>
+      <w:numFmt w:val="bullet"/>
+      <w:lvlText w:val="o"/>
+      <w:lvlJc w:val="left"/>
+      <w:pPr>
+        <w:ind w:left="5760" w:hanging="360"/>
+      </w:pPr>
+      <w:rPr>
+        <w:rFonts w:ascii="Courier New" w:hAnsi="Courier New" w:cs="Courier New" w:hint="default"/>
+      </w:rPr>
+    </w:lvl>
+    <w:lvl w:ilvl="8" w:tplc="04190005" w:tentative="1">
+      <w:start w:val="1"/>
+      <w:numFmt w:val="bullet"/>
+      <w:lvlText w:val=""/>
+      <w:lvlJc w:val="left"/>
+      <w:pPr>
+        <w:ind w:left="6480" w:hanging="360"/>
+      </w:pPr>
+      <w:rPr>
+        <w:rFonts w:ascii="Wingdings" w:hAnsi="Wingdings" w:hint="default"/>
+      </w:rPr>
+    </w:lvl>
+  </w:abstractNum>
+  <w:abstractNum w:abstractNumId="1" w15:restartNumberingAfterBreak="0">
     <w:nsid w:val="516902D5"/>
     <w:multiLevelType w:val="hybridMultilevel"/>
     <w:tmpl w:val="B0484D2C"/>
@@ -5840,7 +7604,7 @@
       <w:lvlJc w:val="left"/>
     </w:lvl>
   </w:abstractNum>
-  <w:abstractNum w:abstractNumId="1" w15:restartNumberingAfterBreak="0">
+  <w:abstractNum w:abstractNumId="2" w15:restartNumberingAfterBreak="0">
     <w:nsid w:val="578725B5"/>
     <w:multiLevelType w:val="hybridMultilevel"/>
     <w:tmpl w:val="9CF61588"/>
@@ -5926,7 +7690,7 @@
       </w:pPr>
     </w:lvl>
   </w:abstractNum>
-  <w:abstractNum w:abstractNumId="2" w15:restartNumberingAfterBreak="0">
+  <w:abstractNum w:abstractNumId="3" w15:restartNumberingAfterBreak="0">
     <w:nsid w:val="61750884"/>
     <w:multiLevelType w:val="hybridMultilevel"/>
     <w:tmpl w:val="BE007806"/>
@@ -5980,7 +7744,7 @@
       <w:lvlJc w:val="left"/>
     </w:lvl>
   </w:abstractNum>
-  <w:abstractNum w:abstractNumId="3" w15:restartNumberingAfterBreak="0">
+  <w:abstractNum w:abstractNumId="4" w15:restartNumberingAfterBreak="0">
     <w:nsid w:val="619A0E70"/>
     <w:multiLevelType w:val="hybridMultilevel"/>
     <w:tmpl w:val="062AE656"/>
@@ -6034,7 +7798,7 @@
       <w:lvlJc w:val="left"/>
     </w:lvl>
   </w:abstractNum>
-  <w:abstractNum w:abstractNumId="4" w15:restartNumberingAfterBreak="0">
+  <w:abstractNum w:abstractNumId="5" w15:restartNumberingAfterBreak="0">
     <w:nsid w:val="6B7D7053"/>
     <w:multiLevelType w:val="hybridMultilevel"/>
     <w:tmpl w:val="F4C858C4"/>
@@ -6089,34 +7853,37 @@
     </w:lvl>
   </w:abstractNum>
   <w:num w:numId="1" w16cid:durableId="870997898">
+    <w:abstractNumId w:val="2"/>
+    <w:lvlOverride w:ilvl="0">
+      <w:startOverride w:val="1"/>
+    </w:lvlOverride>
+  </w:num>
+  <w:num w:numId="2" w16cid:durableId="64453965">
     <w:abstractNumId w:val="1"/>
     <w:lvlOverride w:ilvl="0">
       <w:startOverride w:val="1"/>
     </w:lvlOverride>
   </w:num>
-  <w:num w:numId="2" w16cid:durableId="64453965">
-    <w:abstractNumId w:val="0"/>
-    <w:lvlOverride w:ilvl="0">
-      <w:startOverride w:val="1"/>
-    </w:lvlOverride>
-  </w:num>
   <w:num w:numId="3" w16cid:durableId="1772697064">
-    <w:abstractNumId w:val="2"/>
+    <w:abstractNumId w:val="3"/>
     <w:lvlOverride w:ilvl="0">
       <w:startOverride w:val="1"/>
     </w:lvlOverride>
   </w:num>
   <w:num w:numId="4" w16cid:durableId="775637865">
+    <w:abstractNumId w:val="5"/>
+    <w:lvlOverride w:ilvl="0">
+      <w:startOverride w:val="1"/>
+    </w:lvlOverride>
+  </w:num>
+  <w:num w:numId="5" w16cid:durableId="609632684">
     <w:abstractNumId w:val="4"/>
     <w:lvlOverride w:ilvl="0">
       <w:startOverride w:val="1"/>
     </w:lvlOverride>
   </w:num>
-  <w:num w:numId="5" w16cid:durableId="609632684">
-    <w:abstractNumId w:val="3"/>
-    <w:lvlOverride w:ilvl="0">
-      <w:startOverride w:val="1"/>
-    </w:lvlOverride>
+  <w:num w:numId="6" w16cid:durableId="1073233250">
+    <w:abstractNumId w:val="0"/>
   </w:num>
 </w:numbering>
 </file>

</xml_diff>